<commit_message>
NTPServer manuals: update LED scheme (green=GPS, blue=NTP, amber=holdover; single heartbeat)
</commit_message>
<xml_diff>
--- a/NTPServer Operator Manual.docx
+++ b/NTPServer Operator Manual.docx
@@ -215,8 +215,8 @@
     <w:p>
       <w:pPr>
         <w:sectPr>
-          <w:headerReference w:type="default" r:id="rId149"/>
-          <w:footerReference w:type="default" r:id="rId150"/>
+          <w:headerReference w:type="default" r:id="rId177"/>
+          <w:footerReference w:type="default" r:id="rId178"/>
           <w:pgSz w:w="12240" w:h="15840"/>
           <w:pgMar w:top="1440" w:right="1800" w:bottom="1440" w:left="1800" w:header="720" w:footer="720" w:gutter="0"/>
           <w:cols w:space="720"/>
@@ -637,8 +637,8 @@
     <w:p>
       <w:pPr>
         <w:sectPr>
-          <w:headerReference w:type="default" r:id="rId151"/>
-          <w:footerReference w:type="default" r:id="rId152"/>
+          <w:headerReference w:type="default" r:id="rId179"/>
+          <w:footerReference w:type="default" r:id="rId180"/>
           <w:pgSz w:w="12240" w:h="15840"/>
           <w:pgMar w:top="1440" w:right="1800" w:bottom="1440" w:left="1800" w:header="720" w:footer="720" w:gutter="0"/>
           <w:cols w:space="720"/>
@@ -839,7 +839,7 @@
           <w:rFonts w:ascii="Arial" w:hAnsi="Arial"/>
           <w:sz w:val="22"/>
         </w:rPr>
-        <w:t>After reboot the server joins your WiFi and begins serving as soon as a time source is locked. A first GPS fix from a cold start can take from under a minute to several minutes depending on how much open sky the unit can see. The STATUS LED shows progress (Section 8), and the status web page shows the live state.</w:t>
+        <w:t>After reboot the server joins your WiFi and begins serving as soon as a time source is locked. A first GPS fix from a cold start can take from under a minute to several minutes depending on how much open sky the unit can see. The STATUS LED shows progress (Section 7), and the status web page shows the live state.</w:t>
       </w:r>
     </w:p>
     <w:p>
@@ -1114,8 +1114,8 @@
     <w:p>
       <w:pPr>
         <w:sectPr>
-          <w:headerReference w:type="default" r:id="rId153"/>
-          <w:footerReference w:type="default" r:id="rId154"/>
+          <w:headerReference w:type="default" r:id="rId181"/>
+          <w:footerReference w:type="default" r:id="rId182"/>
           <w:pgSz w:w="12240" w:h="15840"/>
           <w:pgMar w:top="1440" w:right="1800" w:bottom="1440" w:left="1800" w:header="720" w:footer="720" w:gutter="0"/>
           <w:cols w:space="720"/>
@@ -1377,8 +1377,8 @@
     <w:p>
       <w:pPr>
         <w:sectPr>
-          <w:headerReference w:type="default" r:id="rId155"/>
-          <w:footerReference w:type="default" r:id="rId156"/>
+          <w:headerReference w:type="default" r:id="rId183"/>
+          <w:footerReference w:type="default" r:id="rId184"/>
           <w:pgSz w:w="12240" w:h="15840"/>
           <w:pgMar w:top="1440" w:right="1800" w:bottom="1440" w:left="1800" w:header="720" w:footer="720" w:gutter="0"/>
           <w:cols w:space="720"/>
@@ -1726,8 +1726,8 @@
     <w:p>
       <w:pPr>
         <w:sectPr>
-          <w:headerReference w:type="default" r:id="rId157"/>
-          <w:footerReference w:type="default" r:id="rId158"/>
+          <w:headerReference w:type="default" r:id="rId185"/>
+          <w:footerReference w:type="default" r:id="rId186"/>
           <w:pgSz w:w="12240" w:h="15840"/>
           <w:pgMar w:top="1440" w:right="1800" w:bottom="1440" w:left="1800" w:header="720" w:footer="720" w:gutter="0"/>
           <w:cols w:space="720"/>
@@ -2046,8 +2046,8 @@
     <w:p>
       <w:pPr>
         <w:sectPr>
-          <w:headerReference w:type="default" r:id="rId159"/>
-          <w:footerReference w:type="default" r:id="rId160"/>
+          <w:headerReference w:type="default" r:id="rId187"/>
+          <w:footerReference w:type="default" r:id="rId188"/>
           <w:pgSz w:w="12240" w:h="15840"/>
           <w:pgMar w:top="1440" w:right="1800" w:bottom="1440" w:left="1800" w:header="720" w:footer="720" w:gutter="0"/>
           <w:cols w:space="720"/>
@@ -2260,8 +2260,8 @@
     <w:p>
       <w:pPr>
         <w:sectPr>
-          <w:headerReference w:type="default" r:id="rId161"/>
-          <w:footerReference w:type="default" r:id="rId162"/>
+          <w:headerReference w:type="default" r:id="rId189"/>
+          <w:footerReference w:type="default" r:id="rId190"/>
           <w:pgSz w:w="12240" w:h="15840"/>
           <w:pgMar w:top="1440" w:right="1800" w:bottom="1440" w:left="1800" w:header="720" w:footer="720" w:gutter="0"/>
           <w:cols w:space="720"/>
@@ -2795,8 +2795,8 @@
     <w:p>
       <w:pPr>
         <w:sectPr>
-          <w:headerReference w:type="default" r:id="rId163"/>
-          <w:footerReference w:type="default" r:id="rId164"/>
+          <w:headerReference w:type="default" r:id="rId191"/>
+          <w:footerReference w:type="default" r:id="rId192"/>
           <w:pgSz w:w="12240" w:h="15840"/>
           <w:pgMar w:top="1440" w:right="1800" w:bottom="1440" w:left="1800" w:header="720" w:footer="720" w:gutter="0"/>
           <w:cols w:space="720"/>
@@ -3331,8 +3331,8 @@
     <w:p>
       <w:pPr>
         <w:sectPr>
-          <w:headerReference w:type="default" r:id="rId165"/>
-          <w:footerReference w:type="default" r:id="rId166"/>
+          <w:headerReference w:type="default" r:id="rId193"/>
+          <w:footerReference w:type="default" r:id="rId194"/>
           <w:pgSz w:w="12240" w:h="15840"/>
           <w:pgMar w:top="1440" w:right="1800" w:bottom="1440" w:left="1800" w:header="720" w:footer="720" w:gutter="0"/>
           <w:cols w:space="720"/>
@@ -3413,7 +3413,7 @@
           <w:rFonts w:ascii="Arial" w:hAnsi="Arial"/>
           <w:sz w:val="22"/>
         </w:rPr>
-        <w:t>The two top LEDs report what the server is doing. The STATUS LED's color encodes the active time source, and its blink pattern encodes the lock state; the ACTIVITY LED flashes as requests are served.</w:t>
+        <w:t>The two top LEDs report what the server is doing. The STATUS LED pulses one short heartbeat per second; its color tells you the active state — green for GPS, blue for NTP, amber for GPS holdover. The ACTIVITY LED flashes as requests are served.</w:t>
       </w:r>
     </w:p>
     <w:tbl>
@@ -3524,7 +3524,7 @@
               <w:rPr>
                 <w:rFonts w:ascii="Arial" w:hAnsi="Arial"/>
                 <w:b/>
-                <w:color w:val="2563EB"/>
+                <w:color w:val="1E9E4A"/>
                 <w:sz w:val="30"/>
               </w:rPr>
               <w:t xml:space="preserve">● </w:t>
@@ -3534,7 +3534,7 @@
                 <w:rFonts w:ascii="Arial" w:hAnsi="Arial"/>
                 <w:sz w:val="20"/>
               </w:rPr>
-              <w:t>Blue — one short heartbeat pulse per second</w:t>
+              <w:t>Green — one short heartbeat pulse per second</w:t>
             </w:r>
           </w:p>
         </w:tc>
@@ -3580,7 +3580,7 @@
               <w:rPr>
                 <w:rFonts w:ascii="Arial" w:hAnsi="Arial"/>
                 <w:b/>
-                <w:color w:val="1E9E4A"/>
+                <w:color w:val="2563EB"/>
                 <w:sz w:val="30"/>
               </w:rPr>
               <w:t xml:space="preserve">● </w:t>
@@ -3590,7 +3590,7 @@
                 <w:rFonts w:ascii="Arial" w:hAnsi="Arial"/>
                 <w:sz w:val="20"/>
               </w:rPr>
-              <w:t>Green — double-blink every two seconds</w:t>
+              <w:t>Blue — one short heartbeat pulse per second</w:t>
             </w:r>
           </w:p>
         </w:tc>
@@ -3646,7 +3646,7 @@
                 <w:rFonts w:ascii="Arial" w:hAnsi="Arial"/>
                 <w:sz w:val="20"/>
               </w:rPr>
-              <w:t>Amber — triple-blink every two seconds</w:t>
+              <w:t>Amber — one heartbeat pulse per second</w:t>
             </w:r>
           </w:p>
         </w:tc>
@@ -3897,8 +3897,8 @@
     <w:p>
       <w:pPr>
         <w:sectPr>
-          <w:headerReference w:type="default" r:id="rId167"/>
-          <w:footerReference w:type="default" r:id="rId168"/>
+          <w:headerReference w:type="default" r:id="rId195"/>
+          <w:footerReference w:type="default" r:id="rId196"/>
           <w:pgSz w:w="12240" w:h="15840"/>
           <w:pgMar w:top="1440" w:right="1800" w:bottom="1440" w:left="1800" w:header="720" w:footer="720" w:gutter="0"/>
           <w:cols w:space="720"/>
@@ -4173,8 +4173,8 @@
     <w:p>
       <w:pPr>
         <w:sectPr>
-          <w:headerReference w:type="default" r:id="rId169"/>
-          <w:footerReference w:type="default" r:id="rId170"/>
+          <w:headerReference w:type="default" r:id="rId197"/>
+          <w:footerReference w:type="default" r:id="rId198"/>
           <w:pgSz w:w="12240" w:h="15840"/>
           <w:pgMar w:top="1440" w:right="1800" w:bottom="1440" w:left="1800" w:header="720" w:footer="720" w:gutter="0"/>
           <w:cols w:space="720"/>
@@ -4250,8 +4250,8 @@
     <w:p>
       <w:pPr>
         <w:sectPr>
-          <w:headerReference w:type="default" r:id="rId171"/>
-          <w:footerReference w:type="default" r:id="rId172"/>
+          <w:headerReference w:type="default" r:id="rId199"/>
+          <w:footerReference w:type="default" r:id="rId200"/>
           <w:pgSz w:w="12240" w:h="15840"/>
           <w:pgMar w:top="1440" w:right="1800" w:bottom="1440" w:left="1800" w:header="720" w:footer="720" w:gutter="0"/>
           <w:cols w:space="720"/>
@@ -4648,8 +4648,8 @@
     <w:p>
       <w:pPr>
         <w:sectPr>
-          <w:headerReference w:type="default" r:id="rId173"/>
-          <w:footerReference w:type="default" r:id="rId174"/>
+          <w:headerReference w:type="default" r:id="rId201"/>
+          <w:footerReference w:type="default" r:id="rId202"/>
           <w:pgSz w:w="12240" w:h="15840"/>
           <w:pgMar w:top="1440" w:right="1800" w:bottom="1440" w:left="1800" w:header="720" w:footer="720" w:gutter="0"/>
           <w:cols w:space="720"/>
@@ -5014,8 +5014,8 @@
     <w:p>
       <w:pPr>
         <w:sectPr>
-          <w:headerReference w:type="default" r:id="rId175"/>
-          <w:footerReference w:type="default" r:id="rId176"/>
+          <w:headerReference w:type="default" r:id="rId203"/>
+          <w:footerReference w:type="default" r:id="rId204"/>
           <w:pgSz w:w="12240" w:h="15840"/>
           <w:pgMar w:top="1440" w:right="1800" w:bottom="1440" w:left="1800" w:header="720" w:footer="720" w:gutter="0"/>
           <w:cols w:space="720"/>
@@ -5098,8 +5098,8 @@
       </w:r>
     </w:p>
     <w:sectPr>
-      <w:headerReference w:type="default" r:id="rId177"/>
-      <w:footerReference w:type="default" r:id="rId178"/>
+      <w:headerReference w:type="default" r:id="rId205"/>
+      <w:footerReference w:type="default" r:id="rId206"/>
       <w:pgSz w:w="12240" w:h="15840"/>
       <w:pgMar w:top="1440" w:right="1800" w:bottom="1440" w:left="1800" w:header="720" w:footer="720" w:gutter="0"/>
       <w:cols w:space="720"/>
@@ -9092,6 +9092,22 @@
       </w:pBdr>
     </w:pPr>
     <w:r/>
+  </w:p>
+</w:ftr>
+</file>
+
+<file path=word/footer86.xml><?xml version="1.0" encoding="utf-8"?>
+<w:ftr xmlns:m="http://schemas.openxmlformats.org/officeDocument/2006/math" xmlns:mc="http://schemas.openxmlformats.org/markup-compatibility/2006" xmlns:mo="http://schemas.microsoft.com/office/mac/office/2008/main" xmlns:mv="urn:schemas-microsoft-com:mac:vml" xmlns:o="urn:schemas-microsoft-com:office:office" xmlns:r="http://schemas.openxmlformats.org/officeDocument/2006/relationships" xmlns:v="urn:schemas-microsoft-com:vml" xmlns:w10="urn:schemas-microsoft-com:office:word" xmlns:w14="http://schemas.microsoft.com/office/word/2010/wordml" xmlns:w="http://schemas.openxmlformats.org/wordprocessingml/2006/main" xmlns:wne="http://schemas.microsoft.com/office/word/2006/wordml" xmlns:wp14="http://schemas.microsoft.com/office/word/2010/wordprocessingDrawing" xmlns:wp="http://schemas.openxmlformats.org/drawingml/2006/wordprocessingDrawing" xmlns:wpc="http://schemas.microsoft.com/office/word/2010/wordprocessingCanvas" xmlns:wpg="http://schemas.microsoft.com/office/word/2010/wordprocessingGroup" xmlns:wpi="http://schemas.microsoft.com/office/word/2010/wordprocessingInk" xmlns:wps="http://schemas.microsoft.com/office/word/2010/wordprocessingShape" mc:Ignorable="w14 wp14">
+  <w:p>
+    <w:pPr>
+      <w:pStyle w:val="Footer"/>
+      <w:spacing w:before="40"/>
+      <w:jc w:val="left"/>
+      <w:pBdr>
+        <w:top w:val="single" w:sz="4" w:space="2" w:color="808080"/>
+      </w:pBdr>
+    </w:pPr>
+    <w:r/>
     <w:r>
       <w:rPr>
         <w:rFonts w:ascii="Arial" w:hAnsi="Arial"/>
@@ -9099,6 +9115,178 @@
         <w:sz w:val="20"/>
       </w:rPr>
       <w:t>Revision 1 — June 2026</w:t>
+    </w:r>
+    <w:r>
+      <w:rPr>
+        <w:rFonts w:ascii="Arial" w:hAnsi="Arial"/>
+      </w:rPr>
+      <w:tab/>
+      <w:tab/>
+    </w:r>
+    <w:r>
+      <w:rPr>
+        <w:rFonts w:ascii="Arial" w:hAnsi="Arial"/>
+        <w:color w:val="555555"/>
+        <w:sz w:val="20"/>
+      </w:rPr>
+      <w:fldChar w:fldCharType="begin"/>
+      <w:instrText xml:space="preserve"> PAGE </w:instrText>
+      <w:fldChar w:fldCharType="separate"/>
+      <w:t>1</w:t>
+      <w:fldChar w:fldCharType="end"/>
+    </w:r>
+  </w:p>
+</w:ftr>
+</file>
+
+<file path=word/footer87.xml><?xml version="1.0" encoding="utf-8"?>
+<w:ftr xmlns:m="http://schemas.openxmlformats.org/officeDocument/2006/math" xmlns:mc="http://schemas.openxmlformats.org/markup-compatibility/2006" xmlns:mo="http://schemas.microsoft.com/office/mac/office/2008/main" xmlns:mv="urn:schemas-microsoft-com:mac:vml" xmlns:o="urn:schemas-microsoft-com:office:office" xmlns:r="http://schemas.openxmlformats.org/officeDocument/2006/relationships" xmlns:v="urn:schemas-microsoft-com:vml" xmlns:w10="urn:schemas-microsoft-com:office:word" xmlns:w14="http://schemas.microsoft.com/office/word/2010/wordml" xmlns:w="http://schemas.openxmlformats.org/wordprocessingml/2006/main" xmlns:wne="http://schemas.microsoft.com/office/word/2006/wordml" xmlns:wp14="http://schemas.microsoft.com/office/word/2010/wordprocessingDrawing" xmlns:wp="http://schemas.openxmlformats.org/drawingml/2006/wordprocessingDrawing" xmlns:wpc="http://schemas.microsoft.com/office/word/2010/wordprocessingCanvas" xmlns:wpg="http://schemas.microsoft.com/office/word/2010/wordprocessingGroup" xmlns:wpi="http://schemas.microsoft.com/office/word/2010/wordprocessingInk" xmlns:wps="http://schemas.microsoft.com/office/word/2010/wordprocessingShape" mc:Ignorable="w14 wp14">
+  <w:p>
+    <w:pPr>
+      <w:pStyle w:val="Footer"/>
+      <w:spacing w:before="40"/>
+      <w:jc w:val="left"/>
+      <w:pBdr>
+        <w:top w:val="single" w:sz="4" w:space="2" w:color="808080"/>
+      </w:pBdr>
+    </w:pPr>
+    <w:r/>
+    <w:r>
+      <w:rPr>
+        <w:rFonts w:ascii="Arial" w:hAnsi="Arial"/>
+        <w:color w:val="555555"/>
+        <w:sz w:val="20"/>
+      </w:rPr>
+      <w:t>Revision 1 — June 2026</w:t>
+    </w:r>
+    <w:r>
+      <w:rPr>
+        <w:rFonts w:ascii="Arial" w:hAnsi="Arial"/>
+      </w:rPr>
+      <w:tab/>
+      <w:tab/>
+    </w:r>
+    <w:r>
+      <w:rPr>
+        <w:rFonts w:ascii="Arial" w:hAnsi="Arial"/>
+        <w:color w:val="555555"/>
+        <w:sz w:val="20"/>
+      </w:rPr>
+      <w:t>QS-</w:t>
+    </w:r>
+    <w:r>
+      <w:rPr>
+        <w:rFonts w:ascii="Arial" w:hAnsi="Arial"/>
+        <w:color w:val="555555"/>
+        <w:sz w:val="20"/>
+      </w:rPr>
+      <w:fldChar w:fldCharType="begin"/>
+      <w:instrText xml:space="preserve"> PAGE </w:instrText>
+      <w:fldChar w:fldCharType="separate"/>
+      <w:t>1</w:t>
+      <w:fldChar w:fldCharType="end"/>
+    </w:r>
+  </w:p>
+</w:ftr>
+</file>
+
+<file path=word/footer88.xml><?xml version="1.0" encoding="utf-8"?>
+<w:ftr xmlns:m="http://schemas.openxmlformats.org/officeDocument/2006/math" xmlns:mc="http://schemas.openxmlformats.org/markup-compatibility/2006" xmlns:mo="http://schemas.microsoft.com/office/mac/office/2008/main" xmlns:mv="urn:schemas-microsoft-com:mac:vml" xmlns:o="urn:schemas-microsoft-com:office:office" xmlns:r="http://schemas.openxmlformats.org/officeDocument/2006/relationships" xmlns:v="urn:schemas-microsoft-com:vml" xmlns:w10="urn:schemas-microsoft-com:office:word" xmlns:w14="http://schemas.microsoft.com/office/word/2010/wordml" xmlns:w="http://schemas.openxmlformats.org/wordprocessingml/2006/main" xmlns:wne="http://schemas.microsoft.com/office/word/2006/wordml" xmlns:wp14="http://schemas.microsoft.com/office/word/2010/wordprocessingDrawing" xmlns:wp="http://schemas.openxmlformats.org/drawingml/2006/wordprocessingDrawing" xmlns:wpc="http://schemas.microsoft.com/office/word/2010/wordprocessingCanvas" xmlns:wpg="http://schemas.microsoft.com/office/word/2010/wordprocessingGroup" xmlns:wpi="http://schemas.microsoft.com/office/word/2010/wordprocessingInk" xmlns:wps="http://schemas.microsoft.com/office/word/2010/wordprocessingShape" mc:Ignorable="w14 wp14">
+  <w:p>
+    <w:pPr>
+      <w:pStyle w:val="Footer"/>
+      <w:spacing w:before="40"/>
+      <w:jc w:val="left"/>
+      <w:pBdr>
+        <w:top w:val="single" w:sz="4" w:space="2" w:color="808080"/>
+      </w:pBdr>
+    </w:pPr>
+    <w:r/>
+    <w:r>
+      <w:rPr>
+        <w:rFonts w:ascii="Arial" w:hAnsi="Arial"/>
+        <w:color w:val="555555"/>
+        <w:sz w:val="20"/>
+      </w:rPr>
+      <w:t>Revision 1 — June 2026</w:t>
+    </w:r>
+    <w:r>
+      <w:rPr>
+        <w:rFonts w:ascii="Arial" w:hAnsi="Arial"/>
+      </w:rPr>
+      <w:tab/>
+      <w:tab/>
+    </w:r>
+    <w:r>
+      <w:rPr>
+        <w:rFonts w:ascii="Arial" w:hAnsi="Arial"/>
+        <w:color w:val="555555"/>
+        <w:sz w:val="20"/>
+      </w:rPr>
+      <w:t>1-</w:t>
+    </w:r>
+    <w:r>
+      <w:rPr>
+        <w:rFonts w:ascii="Arial" w:hAnsi="Arial"/>
+        <w:color w:val="555555"/>
+        <w:sz w:val="20"/>
+      </w:rPr>
+      <w:fldChar w:fldCharType="begin"/>
+      <w:instrText xml:space="preserve"> PAGE </w:instrText>
+      <w:fldChar w:fldCharType="separate"/>
+      <w:t>1</w:t>
+      <w:fldChar w:fldCharType="end"/>
+    </w:r>
+  </w:p>
+</w:ftr>
+</file>
+
+<file path=word/footer89.xml><?xml version="1.0" encoding="utf-8"?>
+<w:ftr xmlns:m="http://schemas.openxmlformats.org/officeDocument/2006/math" xmlns:mc="http://schemas.openxmlformats.org/markup-compatibility/2006" xmlns:mo="http://schemas.microsoft.com/office/mac/office/2008/main" xmlns:mv="urn:schemas-microsoft-com:mac:vml" xmlns:o="urn:schemas-microsoft-com:office:office" xmlns:r="http://schemas.openxmlformats.org/officeDocument/2006/relationships" xmlns:v="urn:schemas-microsoft-com:vml" xmlns:w10="urn:schemas-microsoft-com:office:word" xmlns:w14="http://schemas.microsoft.com/office/word/2010/wordml" xmlns:w="http://schemas.openxmlformats.org/wordprocessingml/2006/main" xmlns:wne="http://schemas.microsoft.com/office/word/2006/wordml" xmlns:wp14="http://schemas.microsoft.com/office/word/2010/wordprocessingDrawing" xmlns:wp="http://schemas.openxmlformats.org/drawingml/2006/wordprocessingDrawing" xmlns:wpc="http://schemas.microsoft.com/office/word/2010/wordprocessingCanvas" xmlns:wpg="http://schemas.microsoft.com/office/word/2010/wordprocessingGroup" xmlns:wpi="http://schemas.microsoft.com/office/word/2010/wordprocessingInk" xmlns:wps="http://schemas.microsoft.com/office/word/2010/wordprocessingShape" mc:Ignorable="w14 wp14">
+  <w:p>
+    <w:pPr>
+      <w:pStyle w:val="Footer"/>
+      <w:spacing w:before="40"/>
+      <w:jc w:val="left"/>
+      <w:pBdr>
+        <w:top w:val="single" w:sz="4" w:space="2" w:color="808080"/>
+      </w:pBdr>
+    </w:pPr>
+    <w:r/>
+    <w:r>
+      <w:rPr>
+        <w:rFonts w:ascii="Arial" w:hAnsi="Arial"/>
+        <w:color w:val="555555"/>
+        <w:sz w:val="20"/>
+      </w:rPr>
+      <w:t>Revision 1 — June 2026</w:t>
+    </w:r>
+    <w:r>
+      <w:rPr>
+        <w:rFonts w:ascii="Arial" w:hAnsi="Arial"/>
+      </w:rPr>
+      <w:tab/>
+      <w:tab/>
+    </w:r>
+    <w:r>
+      <w:rPr>
+        <w:rFonts w:ascii="Arial" w:hAnsi="Arial"/>
+        <w:color w:val="555555"/>
+        <w:sz w:val="20"/>
+      </w:rPr>
+      <w:t>2-</w:t>
+    </w:r>
+    <w:r>
+      <w:rPr>
+        <w:rFonts w:ascii="Arial" w:hAnsi="Arial"/>
+        <w:color w:val="555555"/>
+        <w:sz w:val="20"/>
+      </w:rPr>
+      <w:fldChar w:fldCharType="begin"/>
+      <w:instrText xml:space="preserve"> PAGE </w:instrText>
+      <w:fldChar w:fldCharType="separate"/>
+      <w:t>1</w:t>
+      <w:fldChar w:fldCharType="end"/>
     </w:r>
   </w:p>
 </w:ftr>
@@ -9150,6 +9338,489 @@
       <w:fldChar w:fldCharType="separate"/>
       <w:t>1</w:t>
       <w:fldChar w:fldCharType="end"/>
+    </w:r>
+  </w:p>
+</w:ftr>
+</file>
+
+<file path=word/footer90.xml><?xml version="1.0" encoding="utf-8"?>
+<w:ftr xmlns:m="http://schemas.openxmlformats.org/officeDocument/2006/math" xmlns:mc="http://schemas.openxmlformats.org/markup-compatibility/2006" xmlns:mo="http://schemas.microsoft.com/office/mac/office/2008/main" xmlns:mv="urn:schemas-microsoft-com:mac:vml" xmlns:o="urn:schemas-microsoft-com:office:office" xmlns:r="http://schemas.openxmlformats.org/officeDocument/2006/relationships" xmlns:v="urn:schemas-microsoft-com:vml" xmlns:w10="urn:schemas-microsoft-com:office:word" xmlns:w14="http://schemas.microsoft.com/office/word/2010/wordml" xmlns:w="http://schemas.openxmlformats.org/wordprocessingml/2006/main" xmlns:wne="http://schemas.microsoft.com/office/word/2006/wordml" xmlns:wp14="http://schemas.microsoft.com/office/word/2010/wordprocessingDrawing" xmlns:wp="http://schemas.openxmlformats.org/drawingml/2006/wordprocessingDrawing" xmlns:wpc="http://schemas.microsoft.com/office/word/2010/wordprocessingCanvas" xmlns:wpg="http://schemas.microsoft.com/office/word/2010/wordprocessingGroup" xmlns:wpi="http://schemas.microsoft.com/office/word/2010/wordprocessingInk" xmlns:wps="http://schemas.microsoft.com/office/word/2010/wordprocessingShape" mc:Ignorable="w14 wp14">
+  <w:p>
+    <w:pPr>
+      <w:pStyle w:val="Footer"/>
+      <w:spacing w:before="40"/>
+      <w:jc w:val="left"/>
+      <w:pBdr>
+        <w:top w:val="single" w:sz="4" w:space="2" w:color="808080"/>
+      </w:pBdr>
+    </w:pPr>
+    <w:r/>
+    <w:r>
+      <w:rPr>
+        <w:rFonts w:ascii="Arial" w:hAnsi="Arial"/>
+        <w:color w:val="555555"/>
+        <w:sz w:val="20"/>
+      </w:rPr>
+      <w:t>Revision 1 — June 2026</w:t>
+    </w:r>
+    <w:r>
+      <w:rPr>
+        <w:rFonts w:ascii="Arial" w:hAnsi="Arial"/>
+      </w:rPr>
+      <w:tab/>
+      <w:tab/>
+    </w:r>
+    <w:r>
+      <w:rPr>
+        <w:rFonts w:ascii="Arial" w:hAnsi="Arial"/>
+        <w:color w:val="555555"/>
+        <w:sz w:val="20"/>
+      </w:rPr>
+      <w:t>3-</w:t>
+    </w:r>
+    <w:r>
+      <w:rPr>
+        <w:rFonts w:ascii="Arial" w:hAnsi="Arial"/>
+        <w:color w:val="555555"/>
+        <w:sz w:val="20"/>
+      </w:rPr>
+      <w:fldChar w:fldCharType="begin"/>
+      <w:instrText xml:space="preserve"> PAGE </w:instrText>
+      <w:fldChar w:fldCharType="separate"/>
+      <w:t>1</w:t>
+      <w:fldChar w:fldCharType="end"/>
+    </w:r>
+  </w:p>
+</w:ftr>
+</file>
+
+<file path=word/footer91.xml><?xml version="1.0" encoding="utf-8"?>
+<w:ftr xmlns:m="http://schemas.openxmlformats.org/officeDocument/2006/math" xmlns:mc="http://schemas.openxmlformats.org/markup-compatibility/2006" xmlns:mo="http://schemas.microsoft.com/office/mac/office/2008/main" xmlns:mv="urn:schemas-microsoft-com:mac:vml" xmlns:o="urn:schemas-microsoft-com:office:office" xmlns:r="http://schemas.openxmlformats.org/officeDocument/2006/relationships" xmlns:v="urn:schemas-microsoft-com:vml" xmlns:w10="urn:schemas-microsoft-com:office:word" xmlns:w14="http://schemas.microsoft.com/office/word/2010/wordml" xmlns:w="http://schemas.openxmlformats.org/wordprocessingml/2006/main" xmlns:wne="http://schemas.microsoft.com/office/word/2006/wordml" xmlns:wp14="http://schemas.microsoft.com/office/word/2010/wordprocessingDrawing" xmlns:wp="http://schemas.openxmlformats.org/drawingml/2006/wordprocessingDrawing" xmlns:wpc="http://schemas.microsoft.com/office/word/2010/wordprocessingCanvas" xmlns:wpg="http://schemas.microsoft.com/office/word/2010/wordprocessingGroup" xmlns:wpi="http://schemas.microsoft.com/office/word/2010/wordprocessingInk" xmlns:wps="http://schemas.microsoft.com/office/word/2010/wordprocessingShape" mc:Ignorable="w14 wp14">
+  <w:p>
+    <w:pPr>
+      <w:pStyle w:val="Footer"/>
+      <w:spacing w:before="40"/>
+      <w:jc w:val="left"/>
+      <w:pBdr>
+        <w:top w:val="single" w:sz="4" w:space="2" w:color="808080"/>
+      </w:pBdr>
+    </w:pPr>
+    <w:r/>
+    <w:r>
+      <w:rPr>
+        <w:rFonts w:ascii="Arial" w:hAnsi="Arial"/>
+        <w:color w:val="555555"/>
+        <w:sz w:val="20"/>
+      </w:rPr>
+      <w:t>Revision 1 — June 2026</w:t>
+    </w:r>
+    <w:r>
+      <w:rPr>
+        <w:rFonts w:ascii="Arial" w:hAnsi="Arial"/>
+      </w:rPr>
+      <w:tab/>
+      <w:tab/>
+    </w:r>
+    <w:r>
+      <w:rPr>
+        <w:rFonts w:ascii="Arial" w:hAnsi="Arial"/>
+        <w:color w:val="555555"/>
+        <w:sz w:val="20"/>
+      </w:rPr>
+      <w:t>4-</w:t>
+    </w:r>
+    <w:r>
+      <w:rPr>
+        <w:rFonts w:ascii="Arial" w:hAnsi="Arial"/>
+        <w:color w:val="555555"/>
+        <w:sz w:val="20"/>
+      </w:rPr>
+      <w:fldChar w:fldCharType="begin"/>
+      <w:instrText xml:space="preserve"> PAGE </w:instrText>
+      <w:fldChar w:fldCharType="separate"/>
+      <w:t>1</w:t>
+      <w:fldChar w:fldCharType="end"/>
+    </w:r>
+  </w:p>
+</w:ftr>
+</file>
+
+<file path=word/footer92.xml><?xml version="1.0" encoding="utf-8"?>
+<w:ftr xmlns:m="http://schemas.openxmlformats.org/officeDocument/2006/math" xmlns:mc="http://schemas.openxmlformats.org/markup-compatibility/2006" xmlns:mo="http://schemas.microsoft.com/office/mac/office/2008/main" xmlns:mv="urn:schemas-microsoft-com:mac:vml" xmlns:o="urn:schemas-microsoft-com:office:office" xmlns:r="http://schemas.openxmlformats.org/officeDocument/2006/relationships" xmlns:v="urn:schemas-microsoft-com:vml" xmlns:w10="urn:schemas-microsoft-com:office:word" xmlns:w14="http://schemas.microsoft.com/office/word/2010/wordml" xmlns:w="http://schemas.openxmlformats.org/wordprocessingml/2006/main" xmlns:wne="http://schemas.microsoft.com/office/word/2006/wordml" xmlns:wp14="http://schemas.microsoft.com/office/word/2010/wordprocessingDrawing" xmlns:wp="http://schemas.openxmlformats.org/drawingml/2006/wordprocessingDrawing" xmlns:wpc="http://schemas.microsoft.com/office/word/2010/wordprocessingCanvas" xmlns:wpg="http://schemas.microsoft.com/office/word/2010/wordprocessingGroup" xmlns:wpi="http://schemas.microsoft.com/office/word/2010/wordprocessingInk" xmlns:wps="http://schemas.microsoft.com/office/word/2010/wordprocessingShape" mc:Ignorable="w14 wp14">
+  <w:p>
+    <w:pPr>
+      <w:pStyle w:val="Footer"/>
+      <w:spacing w:before="40"/>
+      <w:jc w:val="left"/>
+      <w:pBdr>
+        <w:top w:val="single" w:sz="4" w:space="2" w:color="808080"/>
+      </w:pBdr>
+    </w:pPr>
+    <w:r/>
+    <w:r>
+      <w:rPr>
+        <w:rFonts w:ascii="Arial" w:hAnsi="Arial"/>
+        <w:color w:val="555555"/>
+        <w:sz w:val="20"/>
+      </w:rPr>
+      <w:t>Revision 1 — June 2026</w:t>
+    </w:r>
+    <w:r>
+      <w:rPr>
+        <w:rFonts w:ascii="Arial" w:hAnsi="Arial"/>
+      </w:rPr>
+      <w:tab/>
+      <w:tab/>
+    </w:r>
+    <w:r>
+      <w:rPr>
+        <w:rFonts w:ascii="Arial" w:hAnsi="Arial"/>
+        <w:color w:val="555555"/>
+        <w:sz w:val="20"/>
+      </w:rPr>
+      <w:t>5-</w:t>
+    </w:r>
+    <w:r>
+      <w:rPr>
+        <w:rFonts w:ascii="Arial" w:hAnsi="Arial"/>
+        <w:color w:val="555555"/>
+        <w:sz w:val="20"/>
+      </w:rPr>
+      <w:fldChar w:fldCharType="begin"/>
+      <w:instrText xml:space="preserve"> PAGE </w:instrText>
+      <w:fldChar w:fldCharType="separate"/>
+      <w:t>1</w:t>
+      <w:fldChar w:fldCharType="end"/>
+    </w:r>
+  </w:p>
+</w:ftr>
+</file>
+
+<file path=word/footer93.xml><?xml version="1.0" encoding="utf-8"?>
+<w:ftr xmlns:m="http://schemas.openxmlformats.org/officeDocument/2006/math" xmlns:mc="http://schemas.openxmlformats.org/markup-compatibility/2006" xmlns:mo="http://schemas.microsoft.com/office/mac/office/2008/main" xmlns:mv="urn:schemas-microsoft-com:mac:vml" xmlns:o="urn:schemas-microsoft-com:office:office" xmlns:r="http://schemas.openxmlformats.org/officeDocument/2006/relationships" xmlns:v="urn:schemas-microsoft-com:vml" xmlns:w10="urn:schemas-microsoft-com:office:word" xmlns:w14="http://schemas.microsoft.com/office/word/2010/wordml" xmlns:w="http://schemas.openxmlformats.org/wordprocessingml/2006/main" xmlns:wne="http://schemas.microsoft.com/office/word/2006/wordml" xmlns:wp14="http://schemas.microsoft.com/office/word/2010/wordprocessingDrawing" xmlns:wp="http://schemas.openxmlformats.org/drawingml/2006/wordprocessingDrawing" xmlns:wpc="http://schemas.microsoft.com/office/word/2010/wordprocessingCanvas" xmlns:wpg="http://schemas.microsoft.com/office/word/2010/wordprocessingGroup" xmlns:wpi="http://schemas.microsoft.com/office/word/2010/wordprocessingInk" xmlns:wps="http://schemas.microsoft.com/office/word/2010/wordprocessingShape" mc:Ignorable="w14 wp14">
+  <w:p>
+    <w:pPr>
+      <w:pStyle w:val="Footer"/>
+      <w:spacing w:before="40"/>
+      <w:jc w:val="left"/>
+      <w:pBdr>
+        <w:top w:val="single" w:sz="4" w:space="2" w:color="808080"/>
+      </w:pBdr>
+    </w:pPr>
+    <w:r/>
+    <w:r>
+      <w:rPr>
+        <w:rFonts w:ascii="Arial" w:hAnsi="Arial"/>
+        <w:color w:val="555555"/>
+        <w:sz w:val="20"/>
+      </w:rPr>
+      <w:t>Revision 1 — June 2026</w:t>
+    </w:r>
+    <w:r>
+      <w:rPr>
+        <w:rFonts w:ascii="Arial" w:hAnsi="Arial"/>
+      </w:rPr>
+      <w:tab/>
+      <w:tab/>
+    </w:r>
+    <w:r>
+      <w:rPr>
+        <w:rFonts w:ascii="Arial" w:hAnsi="Arial"/>
+        <w:color w:val="555555"/>
+        <w:sz w:val="20"/>
+      </w:rPr>
+      <w:t>6-</w:t>
+    </w:r>
+    <w:r>
+      <w:rPr>
+        <w:rFonts w:ascii="Arial" w:hAnsi="Arial"/>
+        <w:color w:val="555555"/>
+        <w:sz w:val="20"/>
+      </w:rPr>
+      <w:fldChar w:fldCharType="begin"/>
+      <w:instrText xml:space="preserve"> PAGE </w:instrText>
+      <w:fldChar w:fldCharType="separate"/>
+      <w:t>1</w:t>
+      <w:fldChar w:fldCharType="end"/>
+    </w:r>
+  </w:p>
+</w:ftr>
+</file>
+
+<file path=word/footer94.xml><?xml version="1.0" encoding="utf-8"?>
+<w:ftr xmlns:m="http://schemas.openxmlformats.org/officeDocument/2006/math" xmlns:mc="http://schemas.openxmlformats.org/markup-compatibility/2006" xmlns:mo="http://schemas.microsoft.com/office/mac/office/2008/main" xmlns:mv="urn:schemas-microsoft-com:mac:vml" xmlns:o="urn:schemas-microsoft-com:office:office" xmlns:r="http://schemas.openxmlformats.org/officeDocument/2006/relationships" xmlns:v="urn:schemas-microsoft-com:vml" xmlns:w10="urn:schemas-microsoft-com:office:word" xmlns:w14="http://schemas.microsoft.com/office/word/2010/wordml" xmlns:w="http://schemas.openxmlformats.org/wordprocessingml/2006/main" xmlns:wne="http://schemas.microsoft.com/office/word/2006/wordml" xmlns:wp14="http://schemas.microsoft.com/office/word/2010/wordprocessingDrawing" xmlns:wp="http://schemas.openxmlformats.org/drawingml/2006/wordprocessingDrawing" xmlns:wpc="http://schemas.microsoft.com/office/word/2010/wordprocessingCanvas" xmlns:wpg="http://schemas.microsoft.com/office/word/2010/wordprocessingGroup" xmlns:wpi="http://schemas.microsoft.com/office/word/2010/wordprocessingInk" xmlns:wps="http://schemas.microsoft.com/office/word/2010/wordprocessingShape" mc:Ignorable="w14 wp14">
+  <w:p>
+    <w:pPr>
+      <w:pStyle w:val="Footer"/>
+      <w:spacing w:before="40"/>
+      <w:jc w:val="left"/>
+      <w:pBdr>
+        <w:top w:val="single" w:sz="4" w:space="2" w:color="808080"/>
+      </w:pBdr>
+    </w:pPr>
+    <w:r/>
+    <w:r>
+      <w:rPr>
+        <w:rFonts w:ascii="Arial" w:hAnsi="Arial"/>
+        <w:color w:val="555555"/>
+        <w:sz w:val="20"/>
+      </w:rPr>
+      <w:t>Revision 1 — June 2026</w:t>
+    </w:r>
+    <w:r>
+      <w:rPr>
+        <w:rFonts w:ascii="Arial" w:hAnsi="Arial"/>
+      </w:rPr>
+      <w:tab/>
+      <w:tab/>
+    </w:r>
+    <w:r>
+      <w:rPr>
+        <w:rFonts w:ascii="Arial" w:hAnsi="Arial"/>
+        <w:color w:val="555555"/>
+        <w:sz w:val="20"/>
+      </w:rPr>
+      <w:t>7-</w:t>
+    </w:r>
+    <w:r>
+      <w:rPr>
+        <w:rFonts w:ascii="Arial" w:hAnsi="Arial"/>
+        <w:color w:val="555555"/>
+        <w:sz w:val="20"/>
+      </w:rPr>
+      <w:fldChar w:fldCharType="begin"/>
+      <w:instrText xml:space="preserve"> PAGE </w:instrText>
+      <w:fldChar w:fldCharType="separate"/>
+      <w:t>1</w:t>
+      <w:fldChar w:fldCharType="end"/>
+    </w:r>
+  </w:p>
+</w:ftr>
+</file>
+
+<file path=word/footer95.xml><?xml version="1.0" encoding="utf-8"?>
+<w:ftr xmlns:m="http://schemas.openxmlformats.org/officeDocument/2006/math" xmlns:mc="http://schemas.openxmlformats.org/markup-compatibility/2006" xmlns:mo="http://schemas.microsoft.com/office/mac/office/2008/main" xmlns:mv="urn:schemas-microsoft-com:mac:vml" xmlns:o="urn:schemas-microsoft-com:office:office" xmlns:r="http://schemas.openxmlformats.org/officeDocument/2006/relationships" xmlns:v="urn:schemas-microsoft-com:vml" xmlns:w10="urn:schemas-microsoft-com:office:word" xmlns:w14="http://schemas.microsoft.com/office/word/2010/wordml" xmlns:w="http://schemas.openxmlformats.org/wordprocessingml/2006/main" xmlns:wne="http://schemas.microsoft.com/office/word/2006/wordml" xmlns:wp14="http://schemas.microsoft.com/office/word/2010/wordprocessingDrawing" xmlns:wp="http://schemas.openxmlformats.org/drawingml/2006/wordprocessingDrawing" xmlns:wpc="http://schemas.microsoft.com/office/word/2010/wordprocessingCanvas" xmlns:wpg="http://schemas.microsoft.com/office/word/2010/wordprocessingGroup" xmlns:wpi="http://schemas.microsoft.com/office/word/2010/wordprocessingInk" xmlns:wps="http://schemas.microsoft.com/office/word/2010/wordprocessingShape" mc:Ignorable="w14 wp14">
+  <w:p>
+    <w:pPr>
+      <w:pStyle w:val="Footer"/>
+      <w:spacing w:before="40"/>
+      <w:jc w:val="left"/>
+      <w:pBdr>
+        <w:top w:val="single" w:sz="4" w:space="2" w:color="808080"/>
+      </w:pBdr>
+    </w:pPr>
+    <w:r/>
+    <w:r>
+      <w:rPr>
+        <w:rFonts w:ascii="Arial" w:hAnsi="Arial"/>
+        <w:color w:val="555555"/>
+        <w:sz w:val="20"/>
+      </w:rPr>
+      <w:t>Revision 1 — June 2026</w:t>
+    </w:r>
+    <w:r>
+      <w:rPr>
+        <w:rFonts w:ascii="Arial" w:hAnsi="Arial"/>
+      </w:rPr>
+      <w:tab/>
+      <w:tab/>
+    </w:r>
+    <w:r>
+      <w:rPr>
+        <w:rFonts w:ascii="Arial" w:hAnsi="Arial"/>
+        <w:color w:val="555555"/>
+        <w:sz w:val="20"/>
+      </w:rPr>
+      <w:t>8-</w:t>
+    </w:r>
+    <w:r>
+      <w:rPr>
+        <w:rFonts w:ascii="Arial" w:hAnsi="Arial"/>
+        <w:color w:val="555555"/>
+        <w:sz w:val="20"/>
+      </w:rPr>
+      <w:fldChar w:fldCharType="begin"/>
+      <w:instrText xml:space="preserve"> PAGE </w:instrText>
+      <w:fldChar w:fldCharType="separate"/>
+      <w:t>1</w:t>
+      <w:fldChar w:fldCharType="end"/>
+    </w:r>
+  </w:p>
+</w:ftr>
+</file>
+
+<file path=word/footer96.xml><?xml version="1.0" encoding="utf-8"?>
+<w:ftr xmlns:m="http://schemas.openxmlformats.org/officeDocument/2006/math" xmlns:mc="http://schemas.openxmlformats.org/markup-compatibility/2006" xmlns:mo="http://schemas.microsoft.com/office/mac/office/2008/main" xmlns:mv="urn:schemas-microsoft-com:mac:vml" xmlns:o="urn:schemas-microsoft-com:office:office" xmlns:r="http://schemas.openxmlformats.org/officeDocument/2006/relationships" xmlns:v="urn:schemas-microsoft-com:vml" xmlns:w10="urn:schemas-microsoft-com:office:word" xmlns:w14="http://schemas.microsoft.com/office/word/2010/wordml" xmlns:w="http://schemas.openxmlformats.org/wordprocessingml/2006/main" xmlns:wne="http://schemas.microsoft.com/office/word/2006/wordml" xmlns:wp14="http://schemas.microsoft.com/office/word/2010/wordprocessingDrawing" xmlns:wp="http://schemas.openxmlformats.org/drawingml/2006/wordprocessingDrawing" xmlns:wpc="http://schemas.microsoft.com/office/word/2010/wordprocessingCanvas" xmlns:wpg="http://schemas.microsoft.com/office/word/2010/wordprocessingGroup" xmlns:wpi="http://schemas.microsoft.com/office/word/2010/wordprocessingInk" xmlns:wps="http://schemas.microsoft.com/office/word/2010/wordprocessingShape" mc:Ignorable="w14 wp14">
+  <w:p>
+    <w:pPr>
+      <w:pStyle w:val="Footer"/>
+      <w:spacing w:before="40"/>
+      <w:jc w:val="left"/>
+      <w:pBdr>
+        <w:top w:val="single" w:sz="4" w:space="2" w:color="808080"/>
+      </w:pBdr>
+    </w:pPr>
+    <w:r/>
+    <w:r>
+      <w:rPr>
+        <w:rFonts w:ascii="Arial" w:hAnsi="Arial"/>
+        <w:color w:val="555555"/>
+        <w:sz w:val="20"/>
+      </w:rPr>
+      <w:t>Revision 1 — June 2026</w:t>
+    </w:r>
+    <w:r>
+      <w:rPr>
+        <w:rFonts w:ascii="Arial" w:hAnsi="Arial"/>
+      </w:rPr>
+      <w:tab/>
+      <w:tab/>
+    </w:r>
+    <w:r>
+      <w:rPr>
+        <w:rFonts w:ascii="Arial" w:hAnsi="Arial"/>
+        <w:color w:val="555555"/>
+        <w:sz w:val="20"/>
+      </w:rPr>
+      <w:t>9-</w:t>
+    </w:r>
+    <w:r>
+      <w:rPr>
+        <w:rFonts w:ascii="Arial" w:hAnsi="Arial"/>
+        <w:color w:val="555555"/>
+        <w:sz w:val="20"/>
+      </w:rPr>
+      <w:fldChar w:fldCharType="begin"/>
+      <w:instrText xml:space="preserve"> PAGE </w:instrText>
+      <w:fldChar w:fldCharType="separate"/>
+      <w:t>1</w:t>
+      <w:fldChar w:fldCharType="end"/>
+    </w:r>
+  </w:p>
+</w:ftr>
+</file>
+
+<file path=word/footer97.xml><?xml version="1.0" encoding="utf-8"?>
+<w:ftr xmlns:m="http://schemas.openxmlformats.org/officeDocument/2006/math" xmlns:mc="http://schemas.openxmlformats.org/markup-compatibility/2006" xmlns:mo="http://schemas.microsoft.com/office/mac/office/2008/main" xmlns:mv="urn:schemas-microsoft-com:mac:vml" xmlns:o="urn:schemas-microsoft-com:office:office" xmlns:r="http://schemas.openxmlformats.org/officeDocument/2006/relationships" xmlns:v="urn:schemas-microsoft-com:vml" xmlns:w10="urn:schemas-microsoft-com:office:word" xmlns:w14="http://schemas.microsoft.com/office/word/2010/wordml" xmlns:w="http://schemas.openxmlformats.org/wordprocessingml/2006/main" xmlns:wne="http://schemas.microsoft.com/office/word/2006/wordml" xmlns:wp14="http://schemas.microsoft.com/office/word/2010/wordprocessingDrawing" xmlns:wp="http://schemas.openxmlformats.org/drawingml/2006/wordprocessingDrawing" xmlns:wpc="http://schemas.microsoft.com/office/word/2010/wordprocessingCanvas" xmlns:wpg="http://schemas.microsoft.com/office/word/2010/wordprocessingGroup" xmlns:wpi="http://schemas.microsoft.com/office/word/2010/wordprocessingInk" xmlns:wps="http://schemas.microsoft.com/office/word/2010/wordprocessingShape" mc:Ignorable="w14 wp14">
+  <w:p>
+    <w:pPr>
+      <w:pStyle w:val="Footer"/>
+      <w:spacing w:before="40"/>
+      <w:jc w:val="left"/>
+      <w:pBdr>
+        <w:top w:val="single" w:sz="4" w:space="2" w:color="808080"/>
+      </w:pBdr>
+    </w:pPr>
+    <w:r/>
+    <w:r>
+      <w:rPr>
+        <w:rFonts w:ascii="Arial" w:hAnsi="Arial"/>
+        <w:color w:val="555555"/>
+        <w:sz w:val="20"/>
+      </w:rPr>
+      <w:t>Revision 1 — June 2026</w:t>
+    </w:r>
+    <w:r>
+      <w:rPr>
+        <w:rFonts w:ascii="Arial" w:hAnsi="Arial"/>
+      </w:rPr>
+      <w:tab/>
+      <w:tab/>
+    </w:r>
+    <w:r>
+      <w:rPr>
+        <w:rFonts w:ascii="Arial" w:hAnsi="Arial"/>
+        <w:color w:val="555555"/>
+        <w:sz w:val="20"/>
+      </w:rPr>
+      <w:t>10-</w:t>
+    </w:r>
+    <w:r>
+      <w:rPr>
+        <w:rFonts w:ascii="Arial" w:hAnsi="Arial"/>
+        <w:color w:val="555555"/>
+        <w:sz w:val="20"/>
+      </w:rPr>
+      <w:fldChar w:fldCharType="begin"/>
+      <w:instrText xml:space="preserve"> PAGE </w:instrText>
+      <w:fldChar w:fldCharType="separate"/>
+      <w:t>1</w:t>
+      <w:fldChar w:fldCharType="end"/>
+    </w:r>
+  </w:p>
+</w:ftr>
+</file>
+
+<file path=word/footer98.xml><?xml version="1.0" encoding="utf-8"?>
+<w:ftr xmlns:m="http://schemas.openxmlformats.org/officeDocument/2006/math" xmlns:mc="http://schemas.openxmlformats.org/markup-compatibility/2006" xmlns:mo="http://schemas.microsoft.com/office/mac/office/2008/main" xmlns:mv="urn:schemas-microsoft-com:mac:vml" xmlns:o="urn:schemas-microsoft-com:office:office" xmlns:r="http://schemas.openxmlformats.org/officeDocument/2006/relationships" xmlns:v="urn:schemas-microsoft-com:vml" xmlns:w10="urn:schemas-microsoft-com:office:word" xmlns:w14="http://schemas.microsoft.com/office/word/2010/wordml" xmlns:w="http://schemas.openxmlformats.org/wordprocessingml/2006/main" xmlns:wne="http://schemas.microsoft.com/office/word/2006/wordml" xmlns:wp14="http://schemas.microsoft.com/office/word/2010/wordprocessingDrawing" xmlns:wp="http://schemas.openxmlformats.org/drawingml/2006/wordprocessingDrawing" xmlns:wpc="http://schemas.microsoft.com/office/word/2010/wordprocessingCanvas" xmlns:wpg="http://schemas.microsoft.com/office/word/2010/wordprocessingGroup" xmlns:wpi="http://schemas.microsoft.com/office/word/2010/wordprocessingInk" xmlns:wps="http://schemas.microsoft.com/office/word/2010/wordprocessingShape" mc:Ignorable="w14 wp14">
+  <w:p>
+    <w:pPr>
+      <w:pStyle w:val="Footer"/>
+      <w:spacing w:before="40"/>
+      <w:jc w:val="left"/>
+      <w:pBdr>
+        <w:top w:val="single" w:sz="4" w:space="2" w:color="808080"/>
+      </w:pBdr>
+    </w:pPr>
+    <w:r/>
+    <w:r>
+      <w:rPr>
+        <w:rFonts w:ascii="Arial" w:hAnsi="Arial"/>
+        <w:color w:val="555555"/>
+        <w:sz w:val="20"/>
+      </w:rPr>
+      <w:t>Revision 1 — June 2026</w:t>
+    </w:r>
+    <w:r>
+      <w:rPr>
+        <w:rFonts w:ascii="Arial" w:hAnsi="Arial"/>
+      </w:rPr>
+      <w:tab/>
+      <w:tab/>
+    </w:r>
+    <w:r>
+      <w:rPr>
+        <w:rFonts w:ascii="Arial" w:hAnsi="Arial"/>
+        <w:color w:val="555555"/>
+        <w:sz w:val="20"/>
+      </w:rPr>
+      <w:t>11-</w:t>
+    </w:r>
+    <w:r>
+      <w:rPr>
+        <w:rFonts w:ascii="Arial" w:hAnsi="Arial"/>
+        <w:color w:val="555555"/>
+        <w:sz w:val="20"/>
+      </w:rPr>
+      <w:fldChar w:fldCharType="begin"/>
+      <w:instrText xml:space="preserve"> PAGE </w:instrText>
+      <w:fldChar w:fldCharType="separate"/>
+      <w:t>1</w:t>
+      <w:fldChar w:fldCharType="end"/>
+    </w:r>
+  </w:p>
+</w:ftr>
+</file>
+
+<file path=word/footer99.xml><?xml version="1.0" encoding="utf-8"?>
+<w:ftr xmlns:m="http://schemas.openxmlformats.org/officeDocument/2006/math" xmlns:mc="http://schemas.openxmlformats.org/markup-compatibility/2006" xmlns:mo="http://schemas.microsoft.com/office/mac/office/2008/main" xmlns:mv="urn:schemas-microsoft-com:mac:vml" xmlns:o="urn:schemas-microsoft-com:office:office" xmlns:r="http://schemas.openxmlformats.org/officeDocument/2006/relationships" xmlns:v="urn:schemas-microsoft-com:vml" xmlns:w10="urn:schemas-microsoft-com:office:word" xmlns:w14="http://schemas.microsoft.com/office/word/2010/wordml" xmlns:w="http://schemas.openxmlformats.org/wordprocessingml/2006/main" xmlns:wne="http://schemas.microsoft.com/office/word/2006/wordml" xmlns:wp14="http://schemas.microsoft.com/office/word/2010/wordprocessingDrawing" xmlns:wp="http://schemas.openxmlformats.org/drawingml/2006/wordprocessingDrawing" xmlns:wpc="http://schemas.microsoft.com/office/word/2010/wordprocessingCanvas" xmlns:wpg="http://schemas.microsoft.com/office/word/2010/wordprocessingGroup" xmlns:wpi="http://schemas.microsoft.com/office/word/2010/wordprocessingInk" xmlns:wps="http://schemas.microsoft.com/office/word/2010/wordprocessingShape" mc:Ignorable="w14 wp14">
+  <w:p>
+    <w:pPr>
+      <w:pStyle w:val="Footer"/>
+      <w:spacing w:before="40"/>
+      <w:jc w:val="left"/>
+      <w:pBdr>
+        <w:top w:val="single" w:sz="4" w:space="2" w:color="808080"/>
+      </w:pBdr>
+    </w:pPr>
+    <w:r/>
+    <w:r>
+      <w:rPr>
+        <w:rFonts w:ascii="Arial" w:hAnsi="Arial"/>
+        <w:color w:val="555555"/>
+        <w:sz w:val="20"/>
+      </w:rPr>
+      <w:t>Revision 1 — June 2026</w:t>
     </w:r>
   </w:p>
 </w:ftr>
@@ -11183,6 +11854,22 @@
       </w:pBdr>
     </w:pPr>
     <w:r/>
+  </w:p>
+</w:hdr>
+</file>
+
+<file path=word/header86.xml><?xml version="1.0" encoding="utf-8"?>
+<w:hdr xmlns:m="http://schemas.openxmlformats.org/officeDocument/2006/math" xmlns:mc="http://schemas.openxmlformats.org/markup-compatibility/2006" xmlns:mo="http://schemas.microsoft.com/office/mac/office/2008/main" xmlns:mv="urn:schemas-microsoft-com:mac:vml" xmlns:o="urn:schemas-microsoft-com:office:office" xmlns:r="http://schemas.openxmlformats.org/officeDocument/2006/relationships" xmlns:v="urn:schemas-microsoft-com:vml" xmlns:w10="urn:schemas-microsoft-com:office:word" xmlns:w14="http://schemas.microsoft.com/office/word/2010/wordml" xmlns:w="http://schemas.openxmlformats.org/wordprocessingml/2006/main" xmlns:wne="http://schemas.microsoft.com/office/word/2006/wordml" xmlns:wp14="http://schemas.microsoft.com/office/word/2010/wordprocessingDrawing" xmlns:wp="http://schemas.openxmlformats.org/drawingml/2006/wordprocessingDrawing" xmlns:wpc="http://schemas.microsoft.com/office/word/2010/wordprocessingCanvas" xmlns:wpg="http://schemas.microsoft.com/office/word/2010/wordprocessingGroup" xmlns:wpi="http://schemas.microsoft.com/office/word/2010/wordprocessingInk" xmlns:wps="http://schemas.microsoft.com/office/word/2010/wordprocessingShape" mc:Ignorable="w14 wp14">
+  <w:p>
+    <w:pPr>
+      <w:pStyle w:val="Header"/>
+      <w:spacing w:after="40"/>
+      <w:jc w:val="right"/>
+      <w:pBdr>
+        <w:bottom w:val="single" w:sz="4" w:space="2" w:color="808080"/>
+      </w:pBdr>
+    </w:pPr>
+    <w:r/>
     <w:r>
       <w:rPr>
         <w:rFonts w:ascii="Arial" w:hAnsi="Arial"/>
@@ -11190,7 +11877,82 @@
         <w:color w:val="555555"/>
         <w:sz w:val="20"/>
       </w:rPr>
-      <w:t>Notices</w:t>
+      <w:t>Table of Contents</w:t>
+    </w:r>
+  </w:p>
+</w:hdr>
+</file>
+
+<file path=word/header87.xml><?xml version="1.0" encoding="utf-8"?>
+<w:hdr xmlns:m="http://schemas.openxmlformats.org/officeDocument/2006/math" xmlns:mc="http://schemas.openxmlformats.org/markup-compatibility/2006" xmlns:mo="http://schemas.microsoft.com/office/mac/office/2008/main" xmlns:mv="urn:schemas-microsoft-com:mac:vml" xmlns:o="urn:schemas-microsoft-com:office:office" xmlns:r="http://schemas.openxmlformats.org/officeDocument/2006/relationships" xmlns:v="urn:schemas-microsoft-com:vml" xmlns:w10="urn:schemas-microsoft-com:office:word" xmlns:w14="http://schemas.microsoft.com/office/word/2010/wordml" xmlns:w="http://schemas.openxmlformats.org/wordprocessingml/2006/main" xmlns:wne="http://schemas.microsoft.com/office/word/2006/wordml" xmlns:wp14="http://schemas.microsoft.com/office/word/2010/wordprocessingDrawing" xmlns:wp="http://schemas.openxmlformats.org/drawingml/2006/wordprocessingDrawing" xmlns:wpc="http://schemas.microsoft.com/office/word/2010/wordprocessingCanvas" xmlns:wpg="http://schemas.microsoft.com/office/word/2010/wordprocessingGroup" xmlns:wpi="http://schemas.microsoft.com/office/word/2010/wordprocessingInk" xmlns:wps="http://schemas.microsoft.com/office/word/2010/wordprocessingShape" mc:Ignorable="w14 wp14">
+  <w:p>
+    <w:pPr>
+      <w:pStyle w:val="Header"/>
+      <w:spacing w:after="40"/>
+      <w:jc w:val="right"/>
+      <w:pBdr>
+        <w:bottom w:val="single" w:sz="4" w:space="2" w:color="808080"/>
+      </w:pBdr>
+    </w:pPr>
+    <w:r/>
+    <w:r>
+      <w:rPr>
+        <w:rFonts w:ascii="Arial" w:hAnsi="Arial"/>
+        <w:b/>
+        <w:color w:val="555555"/>
+        <w:sz w:val="20"/>
+      </w:rPr>
+      <w:t>Quick Start</w:t>
+    </w:r>
+  </w:p>
+</w:hdr>
+</file>
+
+<file path=word/header88.xml><?xml version="1.0" encoding="utf-8"?>
+<w:hdr xmlns:m="http://schemas.openxmlformats.org/officeDocument/2006/math" xmlns:mc="http://schemas.openxmlformats.org/markup-compatibility/2006" xmlns:mo="http://schemas.microsoft.com/office/mac/office/2008/main" xmlns:mv="urn:schemas-microsoft-com:mac:vml" xmlns:o="urn:schemas-microsoft-com:office:office" xmlns:r="http://schemas.openxmlformats.org/officeDocument/2006/relationships" xmlns:v="urn:schemas-microsoft-com:vml" xmlns:w10="urn:schemas-microsoft-com:office:word" xmlns:w14="http://schemas.microsoft.com/office/word/2010/wordml" xmlns:w="http://schemas.openxmlformats.org/wordprocessingml/2006/main" xmlns:wne="http://schemas.microsoft.com/office/word/2006/wordml" xmlns:wp14="http://schemas.microsoft.com/office/word/2010/wordprocessingDrawing" xmlns:wp="http://schemas.openxmlformats.org/drawingml/2006/wordprocessingDrawing" xmlns:wpc="http://schemas.microsoft.com/office/word/2010/wordprocessingCanvas" xmlns:wpg="http://schemas.microsoft.com/office/word/2010/wordprocessingGroup" xmlns:wpi="http://schemas.microsoft.com/office/word/2010/wordprocessingInk" xmlns:wps="http://schemas.microsoft.com/office/word/2010/wordprocessingShape" mc:Ignorable="w14 wp14">
+  <w:p>
+    <w:pPr>
+      <w:pStyle w:val="Header"/>
+      <w:spacing w:after="40"/>
+      <w:jc w:val="right"/>
+      <w:pBdr>
+        <w:bottom w:val="single" w:sz="4" w:space="2" w:color="808080"/>
+      </w:pBdr>
+    </w:pPr>
+    <w:r/>
+    <w:r>
+      <w:rPr>
+        <w:rFonts w:ascii="Arial" w:hAnsi="Arial"/>
+        <w:b/>
+        <w:color w:val="555555"/>
+        <w:sz w:val="20"/>
+      </w:rPr>
+      <w:t>1. Overview</w:t>
+    </w:r>
+  </w:p>
+</w:hdr>
+</file>
+
+<file path=word/header89.xml><?xml version="1.0" encoding="utf-8"?>
+<w:hdr xmlns:m="http://schemas.openxmlformats.org/officeDocument/2006/math" xmlns:mc="http://schemas.openxmlformats.org/markup-compatibility/2006" xmlns:mo="http://schemas.microsoft.com/office/mac/office/2008/main" xmlns:mv="urn:schemas-microsoft-com:mac:vml" xmlns:o="urn:schemas-microsoft-com:office:office" xmlns:r="http://schemas.openxmlformats.org/officeDocument/2006/relationships" xmlns:v="urn:schemas-microsoft-com:vml" xmlns:w10="urn:schemas-microsoft-com:office:word" xmlns:w14="http://schemas.microsoft.com/office/word/2010/wordml" xmlns:w="http://schemas.openxmlformats.org/wordprocessingml/2006/main" xmlns:wne="http://schemas.microsoft.com/office/word/2006/wordml" xmlns:wp14="http://schemas.microsoft.com/office/word/2010/wordprocessingDrawing" xmlns:wp="http://schemas.openxmlformats.org/drawingml/2006/wordprocessingDrawing" xmlns:wpc="http://schemas.microsoft.com/office/word/2010/wordprocessingCanvas" xmlns:wpg="http://schemas.microsoft.com/office/word/2010/wordprocessingGroup" xmlns:wpi="http://schemas.microsoft.com/office/word/2010/wordprocessingInk" xmlns:wps="http://schemas.microsoft.com/office/word/2010/wordprocessingShape" mc:Ignorable="w14 wp14">
+  <w:p>
+    <w:pPr>
+      <w:pStyle w:val="Header"/>
+      <w:spacing w:after="40"/>
+      <w:jc w:val="right"/>
+      <w:pBdr>
+        <w:bottom w:val="single" w:sz="4" w:space="2" w:color="808080"/>
+      </w:pBdr>
+    </w:pPr>
+    <w:r/>
+    <w:r>
+      <w:rPr>
+        <w:rFonts w:ascii="Arial" w:hAnsi="Arial"/>
+        <w:b/>
+        <w:color w:val="555555"/>
+        <w:sz w:val="20"/>
+      </w:rPr>
+      <w:t>2. Theory of Operation</w:t>
     </w:r>
   </w:p>
 </w:hdr>
@@ -11216,6 +11978,256 @@
         <w:sz w:val="20"/>
       </w:rPr>
       <w:t>6. Settings Reference</w:t>
+    </w:r>
+  </w:p>
+</w:hdr>
+</file>
+
+<file path=word/header90.xml><?xml version="1.0" encoding="utf-8"?>
+<w:hdr xmlns:m="http://schemas.openxmlformats.org/officeDocument/2006/math" xmlns:mc="http://schemas.openxmlformats.org/markup-compatibility/2006" xmlns:mo="http://schemas.microsoft.com/office/mac/office/2008/main" xmlns:mv="urn:schemas-microsoft-com:mac:vml" xmlns:o="urn:schemas-microsoft-com:office:office" xmlns:r="http://schemas.openxmlformats.org/officeDocument/2006/relationships" xmlns:v="urn:schemas-microsoft-com:vml" xmlns:w10="urn:schemas-microsoft-com:office:word" xmlns:w14="http://schemas.microsoft.com/office/word/2010/wordml" xmlns:w="http://schemas.openxmlformats.org/wordprocessingml/2006/main" xmlns:wne="http://schemas.microsoft.com/office/word/2006/wordml" xmlns:wp14="http://schemas.microsoft.com/office/word/2010/wordprocessingDrawing" xmlns:wp="http://schemas.openxmlformats.org/drawingml/2006/wordprocessingDrawing" xmlns:wpc="http://schemas.microsoft.com/office/word/2010/wordprocessingCanvas" xmlns:wpg="http://schemas.microsoft.com/office/word/2010/wordprocessingGroup" xmlns:wpi="http://schemas.microsoft.com/office/word/2010/wordprocessingInk" xmlns:wps="http://schemas.microsoft.com/office/word/2010/wordprocessingShape" mc:Ignorable="w14 wp14">
+  <w:p>
+    <w:pPr>
+      <w:pStyle w:val="Header"/>
+      <w:spacing w:after="40"/>
+      <w:jc w:val="right"/>
+      <w:pBdr>
+        <w:bottom w:val="single" w:sz="4" w:space="2" w:color="808080"/>
+      </w:pBdr>
+    </w:pPr>
+    <w:r/>
+    <w:r>
+      <w:rPr>
+        <w:rFonts w:ascii="Arial" w:hAnsi="Arial"/>
+        <w:b/>
+        <w:color w:val="555555"/>
+        <w:sz w:val="20"/>
+      </w:rPr>
+      <w:t>3. Hardware</w:t>
+    </w:r>
+  </w:p>
+</w:hdr>
+</file>
+
+<file path=word/header91.xml><?xml version="1.0" encoding="utf-8"?>
+<w:hdr xmlns:m="http://schemas.openxmlformats.org/officeDocument/2006/math" xmlns:mc="http://schemas.openxmlformats.org/markup-compatibility/2006" xmlns:mo="http://schemas.microsoft.com/office/mac/office/2008/main" xmlns:mv="urn:schemas-microsoft-com:mac:vml" xmlns:o="urn:schemas-microsoft-com:office:office" xmlns:r="http://schemas.openxmlformats.org/officeDocument/2006/relationships" xmlns:v="urn:schemas-microsoft-com:vml" xmlns:w10="urn:schemas-microsoft-com:office:word" xmlns:w14="http://schemas.microsoft.com/office/word/2010/wordml" xmlns:w="http://schemas.openxmlformats.org/wordprocessingml/2006/main" xmlns:wne="http://schemas.microsoft.com/office/word/2006/wordml" xmlns:wp14="http://schemas.microsoft.com/office/word/2010/wordprocessingDrawing" xmlns:wp="http://schemas.openxmlformats.org/drawingml/2006/wordprocessingDrawing" xmlns:wpc="http://schemas.microsoft.com/office/word/2010/wordprocessingCanvas" xmlns:wpg="http://schemas.microsoft.com/office/word/2010/wordprocessingGroup" xmlns:wpi="http://schemas.microsoft.com/office/word/2010/wordprocessingInk" xmlns:wps="http://schemas.microsoft.com/office/word/2010/wordprocessingShape" mc:Ignorable="w14 wp14">
+  <w:p>
+    <w:pPr>
+      <w:pStyle w:val="Header"/>
+      <w:spacing w:after="40"/>
+      <w:jc w:val="right"/>
+      <w:pBdr>
+        <w:bottom w:val="single" w:sz="4" w:space="2" w:color="808080"/>
+      </w:pBdr>
+    </w:pPr>
+    <w:r/>
+    <w:r>
+      <w:rPr>
+        <w:rFonts w:ascii="Arial" w:hAnsi="Arial"/>
+        <w:b/>
+        <w:color w:val="555555"/>
+        <w:sz w:val="20"/>
+      </w:rPr>
+      <w:t>4. First-Time Setup (AP Mode)</w:t>
+    </w:r>
+  </w:p>
+</w:hdr>
+</file>
+
+<file path=word/header92.xml><?xml version="1.0" encoding="utf-8"?>
+<w:hdr xmlns:m="http://schemas.openxmlformats.org/officeDocument/2006/math" xmlns:mc="http://schemas.openxmlformats.org/markup-compatibility/2006" xmlns:mo="http://schemas.microsoft.com/office/mac/office/2008/main" xmlns:mv="urn:schemas-microsoft-com:mac:vml" xmlns:o="urn:schemas-microsoft-com:office:office" xmlns:r="http://schemas.openxmlformats.org/officeDocument/2006/relationships" xmlns:v="urn:schemas-microsoft-com:vml" xmlns:w10="urn:schemas-microsoft-com:office:word" xmlns:w14="http://schemas.microsoft.com/office/word/2010/wordml" xmlns:w="http://schemas.openxmlformats.org/wordprocessingml/2006/main" xmlns:wne="http://schemas.microsoft.com/office/word/2006/wordml" xmlns:wp14="http://schemas.microsoft.com/office/word/2010/wordprocessingDrawing" xmlns:wp="http://schemas.openxmlformats.org/drawingml/2006/wordprocessingDrawing" xmlns:wpc="http://schemas.microsoft.com/office/word/2010/wordprocessingCanvas" xmlns:wpg="http://schemas.microsoft.com/office/word/2010/wordprocessingGroup" xmlns:wpi="http://schemas.microsoft.com/office/word/2010/wordprocessingInk" xmlns:wps="http://schemas.microsoft.com/office/word/2010/wordprocessingShape" mc:Ignorable="w14 wp14">
+  <w:p>
+    <w:pPr>
+      <w:pStyle w:val="Header"/>
+      <w:spacing w:after="40"/>
+      <w:jc w:val="right"/>
+      <w:pBdr>
+        <w:bottom w:val="single" w:sz="4" w:space="2" w:color="808080"/>
+      </w:pBdr>
+    </w:pPr>
+    <w:r/>
+    <w:r>
+      <w:rPr>
+        <w:rFonts w:ascii="Arial" w:hAnsi="Arial"/>
+        <w:b/>
+        <w:color w:val="555555"/>
+        <w:sz w:val="20"/>
+      </w:rPr>
+      <w:t>5. The Status Page</w:t>
+    </w:r>
+  </w:p>
+</w:hdr>
+</file>
+
+<file path=word/header93.xml><?xml version="1.0" encoding="utf-8"?>
+<w:hdr xmlns:m="http://schemas.openxmlformats.org/officeDocument/2006/math" xmlns:mc="http://schemas.openxmlformats.org/markup-compatibility/2006" xmlns:mo="http://schemas.microsoft.com/office/mac/office/2008/main" xmlns:mv="urn:schemas-microsoft-com:mac:vml" xmlns:o="urn:schemas-microsoft-com:office:office" xmlns:r="http://schemas.openxmlformats.org/officeDocument/2006/relationships" xmlns:v="urn:schemas-microsoft-com:vml" xmlns:w10="urn:schemas-microsoft-com:office:word" xmlns:w14="http://schemas.microsoft.com/office/word/2010/wordml" xmlns:w="http://schemas.openxmlformats.org/wordprocessingml/2006/main" xmlns:wne="http://schemas.microsoft.com/office/word/2006/wordml" xmlns:wp14="http://schemas.microsoft.com/office/word/2010/wordprocessingDrawing" xmlns:wp="http://schemas.openxmlformats.org/drawingml/2006/wordprocessingDrawing" xmlns:wpc="http://schemas.microsoft.com/office/word/2010/wordprocessingCanvas" xmlns:wpg="http://schemas.microsoft.com/office/word/2010/wordprocessingGroup" xmlns:wpi="http://schemas.microsoft.com/office/word/2010/wordprocessingInk" xmlns:wps="http://schemas.microsoft.com/office/word/2010/wordprocessingShape" mc:Ignorable="w14 wp14">
+  <w:p>
+    <w:pPr>
+      <w:pStyle w:val="Header"/>
+      <w:spacing w:after="40"/>
+      <w:jc w:val="right"/>
+      <w:pBdr>
+        <w:bottom w:val="single" w:sz="4" w:space="2" w:color="808080"/>
+      </w:pBdr>
+    </w:pPr>
+    <w:r/>
+    <w:r>
+      <w:rPr>
+        <w:rFonts w:ascii="Arial" w:hAnsi="Arial"/>
+        <w:b/>
+        <w:color w:val="555555"/>
+        <w:sz w:val="20"/>
+      </w:rPr>
+      <w:t>6. Settings Reference</w:t>
+    </w:r>
+  </w:p>
+</w:hdr>
+</file>
+
+<file path=word/header94.xml><?xml version="1.0" encoding="utf-8"?>
+<w:hdr xmlns:m="http://schemas.openxmlformats.org/officeDocument/2006/math" xmlns:mc="http://schemas.openxmlformats.org/markup-compatibility/2006" xmlns:mo="http://schemas.microsoft.com/office/mac/office/2008/main" xmlns:mv="urn:schemas-microsoft-com:mac:vml" xmlns:o="urn:schemas-microsoft-com:office:office" xmlns:r="http://schemas.openxmlformats.org/officeDocument/2006/relationships" xmlns:v="urn:schemas-microsoft-com:vml" xmlns:w10="urn:schemas-microsoft-com:office:word" xmlns:w14="http://schemas.microsoft.com/office/word/2010/wordml" xmlns:w="http://schemas.openxmlformats.org/wordprocessingml/2006/main" xmlns:wne="http://schemas.microsoft.com/office/word/2006/wordml" xmlns:wp14="http://schemas.microsoft.com/office/word/2010/wordprocessingDrawing" xmlns:wp="http://schemas.openxmlformats.org/drawingml/2006/wordprocessingDrawing" xmlns:wpc="http://schemas.microsoft.com/office/word/2010/wordprocessingCanvas" xmlns:wpg="http://schemas.microsoft.com/office/word/2010/wordprocessingGroup" xmlns:wpi="http://schemas.microsoft.com/office/word/2010/wordprocessingInk" xmlns:wps="http://schemas.microsoft.com/office/word/2010/wordprocessingShape" mc:Ignorable="w14 wp14">
+  <w:p>
+    <w:pPr>
+      <w:pStyle w:val="Header"/>
+      <w:spacing w:after="40"/>
+      <w:jc w:val="right"/>
+      <w:pBdr>
+        <w:bottom w:val="single" w:sz="4" w:space="2" w:color="808080"/>
+      </w:pBdr>
+    </w:pPr>
+    <w:r/>
+    <w:r>
+      <w:rPr>
+        <w:rFonts w:ascii="Arial" w:hAnsi="Arial"/>
+        <w:b/>
+        <w:color w:val="555555"/>
+        <w:sz w:val="20"/>
+      </w:rPr>
+      <w:t>7. Indicator LEDs and Under-light</w:t>
+    </w:r>
+  </w:p>
+</w:hdr>
+</file>
+
+<file path=word/header95.xml><?xml version="1.0" encoding="utf-8"?>
+<w:hdr xmlns:m="http://schemas.openxmlformats.org/officeDocument/2006/math" xmlns:mc="http://schemas.openxmlformats.org/markup-compatibility/2006" xmlns:mo="http://schemas.microsoft.com/office/mac/office/2008/main" xmlns:mv="urn:schemas-microsoft-com:mac:vml" xmlns:o="urn:schemas-microsoft-com:office:office" xmlns:r="http://schemas.openxmlformats.org/officeDocument/2006/relationships" xmlns:v="urn:schemas-microsoft-com:vml" xmlns:w10="urn:schemas-microsoft-com:office:word" xmlns:w14="http://schemas.microsoft.com/office/word/2010/wordml" xmlns:w="http://schemas.openxmlformats.org/wordprocessingml/2006/main" xmlns:wne="http://schemas.microsoft.com/office/word/2006/wordml" xmlns:wp14="http://schemas.microsoft.com/office/word/2010/wordprocessingDrawing" xmlns:wp="http://schemas.openxmlformats.org/drawingml/2006/wordprocessingDrawing" xmlns:wpc="http://schemas.microsoft.com/office/word/2010/wordprocessingCanvas" xmlns:wpg="http://schemas.microsoft.com/office/word/2010/wordprocessingGroup" xmlns:wpi="http://schemas.microsoft.com/office/word/2010/wordprocessingInk" xmlns:wps="http://schemas.microsoft.com/office/word/2010/wordprocessingShape" mc:Ignorable="w14 wp14">
+  <w:p>
+    <w:pPr>
+      <w:pStyle w:val="Header"/>
+      <w:spacing w:after="40"/>
+      <w:jc w:val="right"/>
+      <w:pBdr>
+        <w:bottom w:val="single" w:sz="4" w:space="2" w:color="808080"/>
+      </w:pBdr>
+    </w:pPr>
+    <w:r/>
+    <w:r>
+      <w:rPr>
+        <w:rFonts w:ascii="Arial" w:hAnsi="Arial"/>
+        <w:b/>
+        <w:color w:val="555555"/>
+        <w:sz w:val="20"/>
+      </w:rPr>
+      <w:t>8. The SW1 Button</w:t>
+    </w:r>
+  </w:p>
+</w:hdr>
+</file>
+
+<file path=word/header96.xml><?xml version="1.0" encoding="utf-8"?>
+<w:hdr xmlns:m="http://schemas.openxmlformats.org/officeDocument/2006/math" xmlns:mc="http://schemas.openxmlformats.org/markup-compatibility/2006" xmlns:mo="http://schemas.microsoft.com/office/mac/office/2008/main" xmlns:mv="urn:schemas-microsoft-com:mac:vml" xmlns:o="urn:schemas-microsoft-com:office:office" xmlns:r="http://schemas.openxmlformats.org/officeDocument/2006/relationships" xmlns:v="urn:schemas-microsoft-com:vml" xmlns:w10="urn:schemas-microsoft-com:office:word" xmlns:w14="http://schemas.microsoft.com/office/word/2010/wordml" xmlns:w="http://schemas.openxmlformats.org/wordprocessingml/2006/main" xmlns:wne="http://schemas.microsoft.com/office/word/2006/wordml" xmlns:wp14="http://schemas.microsoft.com/office/word/2010/wordprocessingDrawing" xmlns:wp="http://schemas.openxmlformats.org/drawingml/2006/wordprocessingDrawing" xmlns:wpc="http://schemas.microsoft.com/office/word/2010/wordprocessingCanvas" xmlns:wpg="http://schemas.microsoft.com/office/word/2010/wordprocessingGroup" xmlns:wpi="http://schemas.microsoft.com/office/word/2010/wordprocessingInk" xmlns:wps="http://schemas.microsoft.com/office/word/2010/wordprocessingShape" mc:Ignorable="w14 wp14">
+  <w:p>
+    <w:pPr>
+      <w:pStyle w:val="Header"/>
+      <w:spacing w:after="40"/>
+      <w:jc w:val="right"/>
+      <w:pBdr>
+        <w:bottom w:val="single" w:sz="4" w:space="2" w:color="808080"/>
+      </w:pBdr>
+    </w:pPr>
+    <w:r/>
+    <w:r>
+      <w:rPr>
+        <w:rFonts w:ascii="Arial" w:hAnsi="Arial"/>
+        <w:b/>
+        <w:color w:val="555555"/>
+        <w:sz w:val="20"/>
+      </w:rPr>
+      <w:t>9. Over the Air Updates</w:t>
+    </w:r>
+  </w:p>
+</w:hdr>
+</file>
+
+<file path=word/header97.xml><?xml version="1.0" encoding="utf-8"?>
+<w:hdr xmlns:m="http://schemas.openxmlformats.org/officeDocument/2006/math" xmlns:mc="http://schemas.openxmlformats.org/markup-compatibility/2006" xmlns:mo="http://schemas.microsoft.com/office/mac/office/2008/main" xmlns:mv="urn:schemas-microsoft-com:mac:vml" xmlns:o="urn:schemas-microsoft-com:office:office" xmlns:r="http://schemas.openxmlformats.org/officeDocument/2006/relationships" xmlns:v="urn:schemas-microsoft-com:vml" xmlns:w10="urn:schemas-microsoft-com:office:word" xmlns:w14="http://schemas.microsoft.com/office/word/2010/wordml" xmlns:w="http://schemas.openxmlformats.org/wordprocessingml/2006/main" xmlns:wne="http://schemas.microsoft.com/office/word/2006/wordml" xmlns:wp14="http://schemas.microsoft.com/office/word/2010/wordprocessingDrawing" xmlns:wp="http://schemas.openxmlformats.org/drawingml/2006/wordprocessingDrawing" xmlns:wpc="http://schemas.microsoft.com/office/word/2010/wordprocessingCanvas" xmlns:wpg="http://schemas.microsoft.com/office/word/2010/wordprocessingGroup" xmlns:wpi="http://schemas.microsoft.com/office/word/2010/wordprocessingInk" xmlns:wps="http://schemas.microsoft.com/office/word/2010/wordprocessingShape" mc:Ignorable="w14 wp14">
+  <w:p>
+    <w:pPr>
+      <w:pStyle w:val="Header"/>
+      <w:spacing w:after="40"/>
+      <w:jc w:val="right"/>
+      <w:pBdr>
+        <w:bottom w:val="single" w:sz="4" w:space="2" w:color="808080"/>
+      </w:pBdr>
+    </w:pPr>
+    <w:r/>
+    <w:r>
+      <w:rPr>
+        <w:rFonts w:ascii="Arial" w:hAnsi="Arial"/>
+        <w:b/>
+        <w:color w:val="555555"/>
+        <w:sz w:val="20"/>
+      </w:rPr>
+      <w:t>10. Specifications</w:t>
+    </w:r>
+  </w:p>
+</w:hdr>
+</file>
+
+<file path=word/header98.xml><?xml version="1.0" encoding="utf-8"?>
+<w:hdr xmlns:m="http://schemas.openxmlformats.org/officeDocument/2006/math" xmlns:mc="http://schemas.openxmlformats.org/markup-compatibility/2006" xmlns:mo="http://schemas.microsoft.com/office/mac/office/2008/main" xmlns:mv="urn:schemas-microsoft-com:mac:vml" xmlns:o="urn:schemas-microsoft-com:office:office" xmlns:r="http://schemas.openxmlformats.org/officeDocument/2006/relationships" xmlns:v="urn:schemas-microsoft-com:vml" xmlns:w10="urn:schemas-microsoft-com:office:word" xmlns:w14="http://schemas.microsoft.com/office/word/2010/wordml" xmlns:w="http://schemas.openxmlformats.org/wordprocessingml/2006/main" xmlns:wne="http://schemas.microsoft.com/office/word/2006/wordml" xmlns:wp14="http://schemas.microsoft.com/office/word/2010/wordprocessingDrawing" xmlns:wp="http://schemas.openxmlformats.org/drawingml/2006/wordprocessingDrawing" xmlns:wpc="http://schemas.microsoft.com/office/word/2010/wordprocessingCanvas" xmlns:wpg="http://schemas.microsoft.com/office/word/2010/wordprocessingGroup" xmlns:wpi="http://schemas.microsoft.com/office/word/2010/wordprocessingInk" xmlns:wps="http://schemas.microsoft.com/office/word/2010/wordprocessingShape" mc:Ignorable="w14 wp14">
+  <w:p>
+    <w:pPr>
+      <w:pStyle w:val="Header"/>
+      <w:spacing w:after="40"/>
+      <w:jc w:val="right"/>
+      <w:pBdr>
+        <w:bottom w:val="single" w:sz="4" w:space="2" w:color="808080"/>
+      </w:pBdr>
+    </w:pPr>
+    <w:r/>
+    <w:r>
+      <w:rPr>
+        <w:rFonts w:ascii="Arial" w:hAnsi="Arial"/>
+        <w:b/>
+        <w:color w:val="555555"/>
+        <w:sz w:val="20"/>
+      </w:rPr>
+      <w:t>11. Troubleshooting</w:t>
+    </w:r>
+  </w:p>
+</w:hdr>
+</file>
+
+<file path=word/header99.xml><?xml version="1.0" encoding="utf-8"?>
+<w:hdr xmlns:m="http://schemas.openxmlformats.org/officeDocument/2006/math" xmlns:mc="http://schemas.openxmlformats.org/markup-compatibility/2006" xmlns:mo="http://schemas.microsoft.com/office/mac/office/2008/main" xmlns:mv="urn:schemas-microsoft-com:mac:vml" xmlns:o="urn:schemas-microsoft-com:office:office" xmlns:r="http://schemas.openxmlformats.org/officeDocument/2006/relationships" xmlns:v="urn:schemas-microsoft-com:vml" xmlns:w10="urn:schemas-microsoft-com:office:word" xmlns:w14="http://schemas.microsoft.com/office/word/2010/wordml" xmlns:w="http://schemas.openxmlformats.org/wordprocessingml/2006/main" xmlns:wne="http://schemas.microsoft.com/office/word/2006/wordml" xmlns:wp14="http://schemas.microsoft.com/office/word/2010/wordprocessingDrawing" xmlns:wp="http://schemas.openxmlformats.org/drawingml/2006/wordprocessingDrawing" xmlns:wpc="http://schemas.microsoft.com/office/word/2010/wordprocessingCanvas" xmlns:wpg="http://schemas.microsoft.com/office/word/2010/wordprocessingGroup" xmlns:wpi="http://schemas.microsoft.com/office/word/2010/wordprocessingInk" xmlns:wps="http://schemas.microsoft.com/office/word/2010/wordprocessingShape" mc:Ignorable="w14 wp14">
+  <w:p>
+    <w:pPr>
+      <w:pStyle w:val="Header"/>
+      <w:spacing w:after="40"/>
+      <w:jc w:val="right"/>
+      <w:pBdr>
+        <w:bottom w:val="single" w:sz="4" w:space="2" w:color="808080"/>
+      </w:pBdr>
+    </w:pPr>
+    <w:r/>
+    <w:r>
+      <w:rPr>
+        <w:rFonts w:ascii="Arial" w:hAnsi="Arial"/>
+        <w:b/>
+        <w:color w:val="555555"/>
+        <w:sz w:val="20"/>
+      </w:rPr>
+      <w:t>Notices</w:t>
     </w:r>
   </w:p>
 </w:hdr>

</xml_diff>

<commit_message>
NTPServer manuals: track major version only (Version 1)
</commit_message>
<xml_diff>
--- a/NTPServer Operator Manual.docx
+++ b/NTPServer Operator Manual.docx
@@ -174,7 +174,7 @@
                 <w:rFonts w:ascii="Arial" w:hAnsi="Arial"/>
                 <w:sz w:val="22"/>
               </w:rPr>
-              <w:t>NTPServer ESP32-S3 firmware (current release)</w:t>
+              <w:t>Version 1</w:t>
             </w:r>
           </w:p>
         </w:tc>
@@ -215,8 +215,8 @@
     <w:p>
       <w:pPr>
         <w:sectPr>
-          <w:headerReference w:type="default" r:id="rId177"/>
-          <w:footerReference w:type="default" r:id="rId178"/>
+          <w:headerReference w:type="default" r:id="rId205"/>
+          <w:footerReference w:type="default" r:id="rId206"/>
           <w:pgSz w:w="12240" w:h="15840"/>
           <w:pgMar w:top="1440" w:right="1800" w:bottom="1440" w:left="1800" w:header="720" w:footer="720" w:gutter="0"/>
           <w:cols w:space="720"/>
@@ -637,8 +637,8 @@
     <w:p>
       <w:pPr>
         <w:sectPr>
-          <w:headerReference w:type="default" r:id="rId179"/>
-          <w:footerReference w:type="default" r:id="rId180"/>
+          <w:headerReference w:type="default" r:id="rId207"/>
+          <w:footerReference w:type="default" r:id="rId208"/>
           <w:pgSz w:w="12240" w:h="15840"/>
           <w:pgMar w:top="1440" w:right="1800" w:bottom="1440" w:left="1800" w:header="720" w:footer="720" w:gutter="0"/>
           <w:cols w:space="720"/>
@@ -1114,8 +1114,8 @@
     <w:p>
       <w:pPr>
         <w:sectPr>
-          <w:headerReference w:type="default" r:id="rId181"/>
-          <w:footerReference w:type="default" r:id="rId182"/>
+          <w:headerReference w:type="default" r:id="rId209"/>
+          <w:footerReference w:type="default" r:id="rId210"/>
           <w:pgSz w:w="12240" w:h="15840"/>
           <w:pgMar w:top="1440" w:right="1800" w:bottom="1440" w:left="1800" w:header="720" w:footer="720" w:gutter="0"/>
           <w:cols w:space="720"/>
@@ -1377,8 +1377,8 @@
     <w:p>
       <w:pPr>
         <w:sectPr>
-          <w:headerReference w:type="default" r:id="rId183"/>
-          <w:footerReference w:type="default" r:id="rId184"/>
+          <w:headerReference w:type="default" r:id="rId211"/>
+          <w:footerReference w:type="default" r:id="rId212"/>
           <w:pgSz w:w="12240" w:h="15840"/>
           <w:pgMar w:top="1440" w:right="1800" w:bottom="1440" w:left="1800" w:header="720" w:footer="720" w:gutter="0"/>
           <w:cols w:space="720"/>
@@ -1726,8 +1726,8 @@
     <w:p>
       <w:pPr>
         <w:sectPr>
-          <w:headerReference w:type="default" r:id="rId185"/>
-          <w:footerReference w:type="default" r:id="rId186"/>
+          <w:headerReference w:type="default" r:id="rId213"/>
+          <w:footerReference w:type="default" r:id="rId214"/>
           <w:pgSz w:w="12240" w:h="15840"/>
           <w:pgMar w:top="1440" w:right="1800" w:bottom="1440" w:left="1800" w:header="720" w:footer="720" w:gutter="0"/>
           <w:cols w:space="720"/>
@@ -2046,8 +2046,8 @@
     <w:p>
       <w:pPr>
         <w:sectPr>
-          <w:headerReference w:type="default" r:id="rId187"/>
-          <w:footerReference w:type="default" r:id="rId188"/>
+          <w:headerReference w:type="default" r:id="rId215"/>
+          <w:footerReference w:type="default" r:id="rId216"/>
           <w:pgSz w:w="12240" w:h="15840"/>
           <w:pgMar w:top="1440" w:right="1800" w:bottom="1440" w:left="1800" w:header="720" w:footer="720" w:gutter="0"/>
           <w:cols w:space="720"/>
@@ -2260,8 +2260,8 @@
     <w:p>
       <w:pPr>
         <w:sectPr>
-          <w:headerReference w:type="default" r:id="rId189"/>
-          <w:footerReference w:type="default" r:id="rId190"/>
+          <w:headerReference w:type="default" r:id="rId217"/>
+          <w:footerReference w:type="default" r:id="rId218"/>
           <w:pgSz w:w="12240" w:h="15840"/>
           <w:pgMar w:top="1440" w:right="1800" w:bottom="1440" w:left="1800" w:header="720" w:footer="720" w:gutter="0"/>
           <w:cols w:space="720"/>
@@ -2795,8 +2795,8 @@
     <w:p>
       <w:pPr>
         <w:sectPr>
-          <w:headerReference w:type="default" r:id="rId191"/>
-          <w:footerReference w:type="default" r:id="rId192"/>
+          <w:headerReference w:type="default" r:id="rId219"/>
+          <w:footerReference w:type="default" r:id="rId220"/>
           <w:pgSz w:w="12240" w:h="15840"/>
           <w:pgMar w:top="1440" w:right="1800" w:bottom="1440" w:left="1800" w:header="720" w:footer="720" w:gutter="0"/>
           <w:cols w:space="720"/>
@@ -3331,8 +3331,8 @@
     <w:p>
       <w:pPr>
         <w:sectPr>
-          <w:headerReference w:type="default" r:id="rId193"/>
-          <w:footerReference w:type="default" r:id="rId194"/>
+          <w:headerReference w:type="default" r:id="rId221"/>
+          <w:footerReference w:type="default" r:id="rId222"/>
           <w:pgSz w:w="12240" w:h="15840"/>
           <w:pgMar w:top="1440" w:right="1800" w:bottom="1440" w:left="1800" w:header="720" w:footer="720" w:gutter="0"/>
           <w:cols w:space="720"/>
@@ -3897,8 +3897,8 @@
     <w:p>
       <w:pPr>
         <w:sectPr>
-          <w:headerReference w:type="default" r:id="rId195"/>
-          <w:footerReference w:type="default" r:id="rId196"/>
+          <w:headerReference w:type="default" r:id="rId223"/>
+          <w:footerReference w:type="default" r:id="rId224"/>
           <w:pgSz w:w="12240" w:h="15840"/>
           <w:pgMar w:top="1440" w:right="1800" w:bottom="1440" w:left="1800" w:header="720" w:footer="720" w:gutter="0"/>
           <w:cols w:space="720"/>
@@ -4173,8 +4173,8 @@
     <w:p>
       <w:pPr>
         <w:sectPr>
-          <w:headerReference w:type="default" r:id="rId197"/>
-          <w:footerReference w:type="default" r:id="rId198"/>
+          <w:headerReference w:type="default" r:id="rId225"/>
+          <w:footerReference w:type="default" r:id="rId226"/>
           <w:pgSz w:w="12240" w:h="15840"/>
           <w:pgMar w:top="1440" w:right="1800" w:bottom="1440" w:left="1800" w:header="720" w:footer="720" w:gutter="0"/>
           <w:cols w:space="720"/>
@@ -4250,8 +4250,8 @@
     <w:p>
       <w:pPr>
         <w:sectPr>
-          <w:headerReference w:type="default" r:id="rId199"/>
-          <w:footerReference w:type="default" r:id="rId200"/>
+          <w:headerReference w:type="default" r:id="rId227"/>
+          <w:footerReference w:type="default" r:id="rId228"/>
           <w:pgSz w:w="12240" w:h="15840"/>
           <w:pgMar w:top="1440" w:right="1800" w:bottom="1440" w:left="1800" w:header="720" w:footer="720" w:gutter="0"/>
           <w:cols w:space="720"/>
@@ -4648,8 +4648,8 @@
     <w:p>
       <w:pPr>
         <w:sectPr>
-          <w:headerReference w:type="default" r:id="rId201"/>
-          <w:footerReference w:type="default" r:id="rId202"/>
+          <w:headerReference w:type="default" r:id="rId229"/>
+          <w:footerReference w:type="default" r:id="rId230"/>
           <w:pgSz w:w="12240" w:h="15840"/>
           <w:pgMar w:top="1440" w:right="1800" w:bottom="1440" w:left="1800" w:header="720" w:footer="720" w:gutter="0"/>
           <w:cols w:space="720"/>
@@ -5014,8 +5014,8 @@
     <w:p>
       <w:pPr>
         <w:sectPr>
-          <w:headerReference w:type="default" r:id="rId203"/>
-          <w:footerReference w:type="default" r:id="rId204"/>
+          <w:headerReference w:type="default" r:id="rId231"/>
+          <w:footerReference w:type="default" r:id="rId232"/>
           <w:pgSz w:w="12240" w:h="15840"/>
           <w:pgMar w:top="1440" w:right="1800" w:bottom="1440" w:left="1800" w:header="720" w:footer="720" w:gutter="0"/>
           <w:cols w:space="720"/>
@@ -5098,8 +5098,8 @@
       </w:r>
     </w:p>
     <w:sectPr>
-      <w:headerReference w:type="default" r:id="rId205"/>
-      <w:footerReference w:type="default" r:id="rId206"/>
+      <w:headerReference w:type="default" r:id="rId233"/>
+      <w:footerReference w:type="default" r:id="rId234"/>
       <w:pgSz w:w="12240" w:h="15840"/>
       <w:pgMar w:top="1440" w:right="1800" w:bottom="1440" w:left="1800" w:header="720" w:footer="720" w:gutter="0"/>
       <w:cols w:space="720"/>
@@ -5172,7 +5172,7 @@
 </w:ftr>
 </file>
 
-<file path=word/footer11.xml><?xml version="1.0" encoding="utf-8"?>
+<file path=word/footer100.xml><?xml version="1.0" encoding="utf-8"?>
 <w:ftr xmlns:m="http://schemas.openxmlformats.org/officeDocument/2006/math" xmlns:mc="http://schemas.openxmlformats.org/markup-compatibility/2006" xmlns:mo="http://schemas.microsoft.com/office/mac/office/2008/main" xmlns:mv="urn:schemas-microsoft-com:mac:vml" xmlns:o="urn:schemas-microsoft-com:office:office" xmlns:r="http://schemas.openxmlformats.org/officeDocument/2006/relationships" xmlns:v="urn:schemas-microsoft-com:vml" xmlns:w10="urn:schemas-microsoft-com:office:word" xmlns:w14="http://schemas.microsoft.com/office/word/2010/wordml" xmlns:w="http://schemas.openxmlformats.org/wordprocessingml/2006/main" xmlns:wne="http://schemas.microsoft.com/office/word/2006/wordml" xmlns:wp14="http://schemas.microsoft.com/office/word/2010/wordprocessingDrawing" xmlns:wp="http://schemas.openxmlformats.org/drawingml/2006/wordprocessingDrawing" xmlns:wpc="http://schemas.microsoft.com/office/word/2010/wordprocessingCanvas" xmlns:wpg="http://schemas.microsoft.com/office/word/2010/wordprocessingGroup" xmlns:wpi="http://schemas.microsoft.com/office/word/2010/wordprocessingInk" xmlns:wps="http://schemas.microsoft.com/office/word/2010/wordprocessingShape" mc:Ignorable="w14 wp14">
   <w:p>
     <w:pPr>
@@ -5205,19 +5205,698 @@
         <w:color w:val="555555"/>
         <w:sz w:val="20"/>
       </w:rPr>
-      <w:t>8-</w:t>
-    </w:r>
-    <w:r>
-      <w:rPr>
-        <w:rFonts w:ascii="Arial" w:hAnsi="Arial"/>
-        <w:color w:val="555555"/>
-        <w:sz w:val="20"/>
-      </w:rPr>
       <w:fldChar w:fldCharType="begin"/>
       <w:instrText xml:space="preserve"> PAGE </w:instrText>
       <w:fldChar w:fldCharType="separate"/>
       <w:t>1</w:t>
       <w:fldChar w:fldCharType="end"/>
+    </w:r>
+  </w:p>
+</w:ftr>
+</file>
+
+<file path=word/footer101.xml><?xml version="1.0" encoding="utf-8"?>
+<w:ftr xmlns:m="http://schemas.openxmlformats.org/officeDocument/2006/math" xmlns:mc="http://schemas.openxmlformats.org/markup-compatibility/2006" xmlns:mo="http://schemas.microsoft.com/office/mac/office/2008/main" xmlns:mv="urn:schemas-microsoft-com:mac:vml" xmlns:o="urn:schemas-microsoft-com:office:office" xmlns:r="http://schemas.openxmlformats.org/officeDocument/2006/relationships" xmlns:v="urn:schemas-microsoft-com:vml" xmlns:w10="urn:schemas-microsoft-com:office:word" xmlns:w14="http://schemas.microsoft.com/office/word/2010/wordml" xmlns:w="http://schemas.openxmlformats.org/wordprocessingml/2006/main" xmlns:wne="http://schemas.microsoft.com/office/word/2006/wordml" xmlns:wp14="http://schemas.microsoft.com/office/word/2010/wordprocessingDrawing" xmlns:wp="http://schemas.openxmlformats.org/drawingml/2006/wordprocessingDrawing" xmlns:wpc="http://schemas.microsoft.com/office/word/2010/wordprocessingCanvas" xmlns:wpg="http://schemas.microsoft.com/office/word/2010/wordprocessingGroup" xmlns:wpi="http://schemas.microsoft.com/office/word/2010/wordprocessingInk" xmlns:wps="http://schemas.microsoft.com/office/word/2010/wordprocessingShape" mc:Ignorable="w14 wp14">
+  <w:p>
+    <w:pPr>
+      <w:pStyle w:val="Footer"/>
+      <w:spacing w:before="40"/>
+      <w:jc w:val="left"/>
+      <w:pBdr>
+        <w:top w:val="single" w:sz="4" w:space="2" w:color="808080"/>
+      </w:pBdr>
+    </w:pPr>
+    <w:r/>
+    <w:r>
+      <w:rPr>
+        <w:rFonts w:ascii="Arial" w:hAnsi="Arial"/>
+        <w:color w:val="555555"/>
+        <w:sz w:val="20"/>
+      </w:rPr>
+      <w:t>Revision 1 — June 2026</w:t>
+    </w:r>
+    <w:r>
+      <w:rPr>
+        <w:rFonts w:ascii="Arial" w:hAnsi="Arial"/>
+      </w:rPr>
+      <w:tab/>
+      <w:tab/>
+    </w:r>
+    <w:r>
+      <w:rPr>
+        <w:rFonts w:ascii="Arial" w:hAnsi="Arial"/>
+        <w:color w:val="555555"/>
+        <w:sz w:val="20"/>
+      </w:rPr>
+      <w:t>QS-</w:t>
+    </w:r>
+    <w:r>
+      <w:rPr>
+        <w:rFonts w:ascii="Arial" w:hAnsi="Arial"/>
+        <w:color w:val="555555"/>
+        <w:sz w:val="20"/>
+      </w:rPr>
+      <w:fldChar w:fldCharType="begin"/>
+      <w:instrText xml:space="preserve"> PAGE </w:instrText>
+      <w:fldChar w:fldCharType="separate"/>
+      <w:t>1</w:t>
+      <w:fldChar w:fldCharType="end"/>
+    </w:r>
+  </w:p>
+</w:ftr>
+</file>
+
+<file path=word/footer102.xml><?xml version="1.0" encoding="utf-8"?>
+<w:ftr xmlns:m="http://schemas.openxmlformats.org/officeDocument/2006/math" xmlns:mc="http://schemas.openxmlformats.org/markup-compatibility/2006" xmlns:mo="http://schemas.microsoft.com/office/mac/office/2008/main" xmlns:mv="urn:schemas-microsoft-com:mac:vml" xmlns:o="urn:schemas-microsoft-com:office:office" xmlns:r="http://schemas.openxmlformats.org/officeDocument/2006/relationships" xmlns:v="urn:schemas-microsoft-com:vml" xmlns:w10="urn:schemas-microsoft-com:office:word" xmlns:w14="http://schemas.microsoft.com/office/word/2010/wordml" xmlns:w="http://schemas.openxmlformats.org/wordprocessingml/2006/main" xmlns:wne="http://schemas.microsoft.com/office/word/2006/wordml" xmlns:wp14="http://schemas.microsoft.com/office/word/2010/wordprocessingDrawing" xmlns:wp="http://schemas.openxmlformats.org/drawingml/2006/wordprocessingDrawing" xmlns:wpc="http://schemas.microsoft.com/office/word/2010/wordprocessingCanvas" xmlns:wpg="http://schemas.microsoft.com/office/word/2010/wordprocessingGroup" xmlns:wpi="http://schemas.microsoft.com/office/word/2010/wordprocessingInk" xmlns:wps="http://schemas.microsoft.com/office/word/2010/wordprocessingShape" mc:Ignorable="w14 wp14">
+  <w:p>
+    <w:pPr>
+      <w:pStyle w:val="Footer"/>
+      <w:spacing w:before="40"/>
+      <w:jc w:val="left"/>
+      <w:pBdr>
+        <w:top w:val="single" w:sz="4" w:space="2" w:color="808080"/>
+      </w:pBdr>
+    </w:pPr>
+    <w:r/>
+    <w:r>
+      <w:rPr>
+        <w:rFonts w:ascii="Arial" w:hAnsi="Arial"/>
+        <w:color w:val="555555"/>
+        <w:sz w:val="20"/>
+      </w:rPr>
+      <w:t>Revision 1 — June 2026</w:t>
+    </w:r>
+    <w:r>
+      <w:rPr>
+        <w:rFonts w:ascii="Arial" w:hAnsi="Arial"/>
+      </w:rPr>
+      <w:tab/>
+      <w:tab/>
+    </w:r>
+    <w:r>
+      <w:rPr>
+        <w:rFonts w:ascii="Arial" w:hAnsi="Arial"/>
+        <w:color w:val="555555"/>
+        <w:sz w:val="20"/>
+      </w:rPr>
+      <w:t>1-</w:t>
+    </w:r>
+    <w:r>
+      <w:rPr>
+        <w:rFonts w:ascii="Arial" w:hAnsi="Arial"/>
+        <w:color w:val="555555"/>
+        <w:sz w:val="20"/>
+      </w:rPr>
+      <w:fldChar w:fldCharType="begin"/>
+      <w:instrText xml:space="preserve"> PAGE </w:instrText>
+      <w:fldChar w:fldCharType="separate"/>
+      <w:t>1</w:t>
+      <w:fldChar w:fldCharType="end"/>
+    </w:r>
+  </w:p>
+</w:ftr>
+</file>
+
+<file path=word/footer103.xml><?xml version="1.0" encoding="utf-8"?>
+<w:ftr xmlns:m="http://schemas.openxmlformats.org/officeDocument/2006/math" xmlns:mc="http://schemas.openxmlformats.org/markup-compatibility/2006" xmlns:mo="http://schemas.microsoft.com/office/mac/office/2008/main" xmlns:mv="urn:schemas-microsoft-com:mac:vml" xmlns:o="urn:schemas-microsoft-com:office:office" xmlns:r="http://schemas.openxmlformats.org/officeDocument/2006/relationships" xmlns:v="urn:schemas-microsoft-com:vml" xmlns:w10="urn:schemas-microsoft-com:office:word" xmlns:w14="http://schemas.microsoft.com/office/word/2010/wordml" xmlns:w="http://schemas.openxmlformats.org/wordprocessingml/2006/main" xmlns:wne="http://schemas.microsoft.com/office/word/2006/wordml" xmlns:wp14="http://schemas.microsoft.com/office/word/2010/wordprocessingDrawing" xmlns:wp="http://schemas.openxmlformats.org/drawingml/2006/wordprocessingDrawing" xmlns:wpc="http://schemas.microsoft.com/office/word/2010/wordprocessingCanvas" xmlns:wpg="http://schemas.microsoft.com/office/word/2010/wordprocessingGroup" xmlns:wpi="http://schemas.microsoft.com/office/word/2010/wordprocessingInk" xmlns:wps="http://schemas.microsoft.com/office/word/2010/wordprocessingShape" mc:Ignorable="w14 wp14">
+  <w:p>
+    <w:pPr>
+      <w:pStyle w:val="Footer"/>
+      <w:spacing w:before="40"/>
+      <w:jc w:val="left"/>
+      <w:pBdr>
+        <w:top w:val="single" w:sz="4" w:space="2" w:color="808080"/>
+      </w:pBdr>
+    </w:pPr>
+    <w:r/>
+    <w:r>
+      <w:rPr>
+        <w:rFonts w:ascii="Arial" w:hAnsi="Arial"/>
+        <w:color w:val="555555"/>
+        <w:sz w:val="20"/>
+      </w:rPr>
+      <w:t>Revision 1 — June 2026</w:t>
+    </w:r>
+    <w:r>
+      <w:rPr>
+        <w:rFonts w:ascii="Arial" w:hAnsi="Arial"/>
+      </w:rPr>
+      <w:tab/>
+      <w:tab/>
+    </w:r>
+    <w:r>
+      <w:rPr>
+        <w:rFonts w:ascii="Arial" w:hAnsi="Arial"/>
+        <w:color w:val="555555"/>
+        <w:sz w:val="20"/>
+      </w:rPr>
+      <w:t>2-</w:t>
+    </w:r>
+    <w:r>
+      <w:rPr>
+        <w:rFonts w:ascii="Arial" w:hAnsi="Arial"/>
+        <w:color w:val="555555"/>
+        <w:sz w:val="20"/>
+      </w:rPr>
+      <w:fldChar w:fldCharType="begin"/>
+      <w:instrText xml:space="preserve"> PAGE </w:instrText>
+      <w:fldChar w:fldCharType="separate"/>
+      <w:t>1</w:t>
+      <w:fldChar w:fldCharType="end"/>
+    </w:r>
+  </w:p>
+</w:ftr>
+</file>
+
+<file path=word/footer104.xml><?xml version="1.0" encoding="utf-8"?>
+<w:ftr xmlns:m="http://schemas.openxmlformats.org/officeDocument/2006/math" xmlns:mc="http://schemas.openxmlformats.org/markup-compatibility/2006" xmlns:mo="http://schemas.microsoft.com/office/mac/office/2008/main" xmlns:mv="urn:schemas-microsoft-com:mac:vml" xmlns:o="urn:schemas-microsoft-com:office:office" xmlns:r="http://schemas.openxmlformats.org/officeDocument/2006/relationships" xmlns:v="urn:schemas-microsoft-com:vml" xmlns:w10="urn:schemas-microsoft-com:office:word" xmlns:w14="http://schemas.microsoft.com/office/word/2010/wordml" xmlns:w="http://schemas.openxmlformats.org/wordprocessingml/2006/main" xmlns:wne="http://schemas.microsoft.com/office/word/2006/wordml" xmlns:wp14="http://schemas.microsoft.com/office/word/2010/wordprocessingDrawing" xmlns:wp="http://schemas.openxmlformats.org/drawingml/2006/wordprocessingDrawing" xmlns:wpc="http://schemas.microsoft.com/office/word/2010/wordprocessingCanvas" xmlns:wpg="http://schemas.microsoft.com/office/word/2010/wordprocessingGroup" xmlns:wpi="http://schemas.microsoft.com/office/word/2010/wordprocessingInk" xmlns:wps="http://schemas.microsoft.com/office/word/2010/wordprocessingShape" mc:Ignorable="w14 wp14">
+  <w:p>
+    <w:pPr>
+      <w:pStyle w:val="Footer"/>
+      <w:spacing w:before="40"/>
+      <w:jc w:val="left"/>
+      <w:pBdr>
+        <w:top w:val="single" w:sz="4" w:space="2" w:color="808080"/>
+      </w:pBdr>
+    </w:pPr>
+    <w:r/>
+    <w:r>
+      <w:rPr>
+        <w:rFonts w:ascii="Arial" w:hAnsi="Arial"/>
+        <w:color w:val="555555"/>
+        <w:sz w:val="20"/>
+      </w:rPr>
+      <w:t>Revision 1 — June 2026</w:t>
+    </w:r>
+    <w:r>
+      <w:rPr>
+        <w:rFonts w:ascii="Arial" w:hAnsi="Arial"/>
+      </w:rPr>
+      <w:tab/>
+      <w:tab/>
+    </w:r>
+    <w:r>
+      <w:rPr>
+        <w:rFonts w:ascii="Arial" w:hAnsi="Arial"/>
+        <w:color w:val="555555"/>
+        <w:sz w:val="20"/>
+      </w:rPr>
+      <w:t>3-</w:t>
+    </w:r>
+    <w:r>
+      <w:rPr>
+        <w:rFonts w:ascii="Arial" w:hAnsi="Arial"/>
+        <w:color w:val="555555"/>
+        <w:sz w:val="20"/>
+      </w:rPr>
+      <w:fldChar w:fldCharType="begin"/>
+      <w:instrText xml:space="preserve"> PAGE </w:instrText>
+      <w:fldChar w:fldCharType="separate"/>
+      <w:t>1</w:t>
+      <w:fldChar w:fldCharType="end"/>
+    </w:r>
+  </w:p>
+</w:ftr>
+</file>
+
+<file path=word/footer105.xml><?xml version="1.0" encoding="utf-8"?>
+<w:ftr xmlns:m="http://schemas.openxmlformats.org/officeDocument/2006/math" xmlns:mc="http://schemas.openxmlformats.org/markup-compatibility/2006" xmlns:mo="http://schemas.microsoft.com/office/mac/office/2008/main" xmlns:mv="urn:schemas-microsoft-com:mac:vml" xmlns:o="urn:schemas-microsoft-com:office:office" xmlns:r="http://schemas.openxmlformats.org/officeDocument/2006/relationships" xmlns:v="urn:schemas-microsoft-com:vml" xmlns:w10="urn:schemas-microsoft-com:office:word" xmlns:w14="http://schemas.microsoft.com/office/word/2010/wordml" xmlns:w="http://schemas.openxmlformats.org/wordprocessingml/2006/main" xmlns:wne="http://schemas.microsoft.com/office/word/2006/wordml" xmlns:wp14="http://schemas.microsoft.com/office/word/2010/wordprocessingDrawing" xmlns:wp="http://schemas.openxmlformats.org/drawingml/2006/wordprocessingDrawing" xmlns:wpc="http://schemas.microsoft.com/office/word/2010/wordprocessingCanvas" xmlns:wpg="http://schemas.microsoft.com/office/word/2010/wordprocessingGroup" xmlns:wpi="http://schemas.microsoft.com/office/word/2010/wordprocessingInk" xmlns:wps="http://schemas.microsoft.com/office/word/2010/wordprocessingShape" mc:Ignorable="w14 wp14">
+  <w:p>
+    <w:pPr>
+      <w:pStyle w:val="Footer"/>
+      <w:spacing w:before="40"/>
+      <w:jc w:val="left"/>
+      <w:pBdr>
+        <w:top w:val="single" w:sz="4" w:space="2" w:color="808080"/>
+      </w:pBdr>
+    </w:pPr>
+    <w:r/>
+    <w:r>
+      <w:rPr>
+        <w:rFonts w:ascii="Arial" w:hAnsi="Arial"/>
+        <w:color w:val="555555"/>
+        <w:sz w:val="20"/>
+      </w:rPr>
+      <w:t>Revision 1 — June 2026</w:t>
+    </w:r>
+    <w:r>
+      <w:rPr>
+        <w:rFonts w:ascii="Arial" w:hAnsi="Arial"/>
+      </w:rPr>
+      <w:tab/>
+      <w:tab/>
+    </w:r>
+    <w:r>
+      <w:rPr>
+        <w:rFonts w:ascii="Arial" w:hAnsi="Arial"/>
+        <w:color w:val="555555"/>
+        <w:sz w:val="20"/>
+      </w:rPr>
+      <w:t>4-</w:t>
+    </w:r>
+    <w:r>
+      <w:rPr>
+        <w:rFonts w:ascii="Arial" w:hAnsi="Arial"/>
+        <w:color w:val="555555"/>
+        <w:sz w:val="20"/>
+      </w:rPr>
+      <w:fldChar w:fldCharType="begin"/>
+      <w:instrText xml:space="preserve"> PAGE </w:instrText>
+      <w:fldChar w:fldCharType="separate"/>
+      <w:t>1</w:t>
+      <w:fldChar w:fldCharType="end"/>
+    </w:r>
+  </w:p>
+</w:ftr>
+</file>
+
+<file path=word/footer106.xml><?xml version="1.0" encoding="utf-8"?>
+<w:ftr xmlns:m="http://schemas.openxmlformats.org/officeDocument/2006/math" xmlns:mc="http://schemas.openxmlformats.org/markup-compatibility/2006" xmlns:mo="http://schemas.microsoft.com/office/mac/office/2008/main" xmlns:mv="urn:schemas-microsoft-com:mac:vml" xmlns:o="urn:schemas-microsoft-com:office:office" xmlns:r="http://schemas.openxmlformats.org/officeDocument/2006/relationships" xmlns:v="urn:schemas-microsoft-com:vml" xmlns:w10="urn:schemas-microsoft-com:office:word" xmlns:w14="http://schemas.microsoft.com/office/word/2010/wordml" xmlns:w="http://schemas.openxmlformats.org/wordprocessingml/2006/main" xmlns:wne="http://schemas.microsoft.com/office/word/2006/wordml" xmlns:wp14="http://schemas.microsoft.com/office/word/2010/wordprocessingDrawing" xmlns:wp="http://schemas.openxmlformats.org/drawingml/2006/wordprocessingDrawing" xmlns:wpc="http://schemas.microsoft.com/office/word/2010/wordprocessingCanvas" xmlns:wpg="http://schemas.microsoft.com/office/word/2010/wordprocessingGroup" xmlns:wpi="http://schemas.microsoft.com/office/word/2010/wordprocessingInk" xmlns:wps="http://schemas.microsoft.com/office/word/2010/wordprocessingShape" mc:Ignorable="w14 wp14">
+  <w:p>
+    <w:pPr>
+      <w:pStyle w:val="Footer"/>
+      <w:spacing w:before="40"/>
+      <w:jc w:val="left"/>
+      <w:pBdr>
+        <w:top w:val="single" w:sz="4" w:space="2" w:color="808080"/>
+      </w:pBdr>
+    </w:pPr>
+    <w:r/>
+    <w:r>
+      <w:rPr>
+        <w:rFonts w:ascii="Arial" w:hAnsi="Arial"/>
+        <w:color w:val="555555"/>
+        <w:sz w:val="20"/>
+      </w:rPr>
+      <w:t>Revision 1 — June 2026</w:t>
+    </w:r>
+    <w:r>
+      <w:rPr>
+        <w:rFonts w:ascii="Arial" w:hAnsi="Arial"/>
+      </w:rPr>
+      <w:tab/>
+      <w:tab/>
+    </w:r>
+    <w:r>
+      <w:rPr>
+        <w:rFonts w:ascii="Arial" w:hAnsi="Arial"/>
+        <w:color w:val="555555"/>
+        <w:sz w:val="20"/>
+      </w:rPr>
+      <w:t>5-</w:t>
+    </w:r>
+    <w:r>
+      <w:rPr>
+        <w:rFonts w:ascii="Arial" w:hAnsi="Arial"/>
+        <w:color w:val="555555"/>
+        <w:sz w:val="20"/>
+      </w:rPr>
+      <w:fldChar w:fldCharType="begin"/>
+      <w:instrText xml:space="preserve"> PAGE </w:instrText>
+      <w:fldChar w:fldCharType="separate"/>
+      <w:t>1</w:t>
+      <w:fldChar w:fldCharType="end"/>
+    </w:r>
+  </w:p>
+</w:ftr>
+</file>
+
+<file path=word/footer107.xml><?xml version="1.0" encoding="utf-8"?>
+<w:ftr xmlns:m="http://schemas.openxmlformats.org/officeDocument/2006/math" xmlns:mc="http://schemas.openxmlformats.org/markup-compatibility/2006" xmlns:mo="http://schemas.microsoft.com/office/mac/office/2008/main" xmlns:mv="urn:schemas-microsoft-com:mac:vml" xmlns:o="urn:schemas-microsoft-com:office:office" xmlns:r="http://schemas.openxmlformats.org/officeDocument/2006/relationships" xmlns:v="urn:schemas-microsoft-com:vml" xmlns:w10="urn:schemas-microsoft-com:office:word" xmlns:w14="http://schemas.microsoft.com/office/word/2010/wordml" xmlns:w="http://schemas.openxmlformats.org/wordprocessingml/2006/main" xmlns:wne="http://schemas.microsoft.com/office/word/2006/wordml" xmlns:wp14="http://schemas.microsoft.com/office/word/2010/wordprocessingDrawing" xmlns:wp="http://schemas.openxmlformats.org/drawingml/2006/wordprocessingDrawing" xmlns:wpc="http://schemas.microsoft.com/office/word/2010/wordprocessingCanvas" xmlns:wpg="http://schemas.microsoft.com/office/word/2010/wordprocessingGroup" xmlns:wpi="http://schemas.microsoft.com/office/word/2010/wordprocessingInk" xmlns:wps="http://schemas.microsoft.com/office/word/2010/wordprocessingShape" mc:Ignorable="w14 wp14">
+  <w:p>
+    <w:pPr>
+      <w:pStyle w:val="Footer"/>
+      <w:spacing w:before="40"/>
+      <w:jc w:val="left"/>
+      <w:pBdr>
+        <w:top w:val="single" w:sz="4" w:space="2" w:color="808080"/>
+      </w:pBdr>
+    </w:pPr>
+    <w:r/>
+    <w:r>
+      <w:rPr>
+        <w:rFonts w:ascii="Arial" w:hAnsi="Arial"/>
+        <w:color w:val="555555"/>
+        <w:sz w:val="20"/>
+      </w:rPr>
+      <w:t>Revision 1 — June 2026</w:t>
+    </w:r>
+    <w:r>
+      <w:rPr>
+        <w:rFonts w:ascii="Arial" w:hAnsi="Arial"/>
+      </w:rPr>
+      <w:tab/>
+      <w:tab/>
+    </w:r>
+    <w:r>
+      <w:rPr>
+        <w:rFonts w:ascii="Arial" w:hAnsi="Arial"/>
+        <w:color w:val="555555"/>
+        <w:sz w:val="20"/>
+      </w:rPr>
+      <w:t>6-</w:t>
+    </w:r>
+    <w:r>
+      <w:rPr>
+        <w:rFonts w:ascii="Arial" w:hAnsi="Arial"/>
+        <w:color w:val="555555"/>
+        <w:sz w:val="20"/>
+      </w:rPr>
+      <w:fldChar w:fldCharType="begin"/>
+      <w:instrText xml:space="preserve"> PAGE </w:instrText>
+      <w:fldChar w:fldCharType="separate"/>
+      <w:t>1</w:t>
+      <w:fldChar w:fldCharType="end"/>
+    </w:r>
+  </w:p>
+</w:ftr>
+</file>
+
+<file path=word/footer108.xml><?xml version="1.0" encoding="utf-8"?>
+<w:ftr xmlns:m="http://schemas.openxmlformats.org/officeDocument/2006/math" xmlns:mc="http://schemas.openxmlformats.org/markup-compatibility/2006" xmlns:mo="http://schemas.microsoft.com/office/mac/office/2008/main" xmlns:mv="urn:schemas-microsoft-com:mac:vml" xmlns:o="urn:schemas-microsoft-com:office:office" xmlns:r="http://schemas.openxmlformats.org/officeDocument/2006/relationships" xmlns:v="urn:schemas-microsoft-com:vml" xmlns:w10="urn:schemas-microsoft-com:office:word" xmlns:w14="http://schemas.microsoft.com/office/word/2010/wordml" xmlns:w="http://schemas.openxmlformats.org/wordprocessingml/2006/main" xmlns:wne="http://schemas.microsoft.com/office/word/2006/wordml" xmlns:wp14="http://schemas.microsoft.com/office/word/2010/wordprocessingDrawing" xmlns:wp="http://schemas.openxmlformats.org/drawingml/2006/wordprocessingDrawing" xmlns:wpc="http://schemas.microsoft.com/office/word/2010/wordprocessingCanvas" xmlns:wpg="http://schemas.microsoft.com/office/word/2010/wordprocessingGroup" xmlns:wpi="http://schemas.microsoft.com/office/word/2010/wordprocessingInk" xmlns:wps="http://schemas.microsoft.com/office/word/2010/wordprocessingShape" mc:Ignorable="w14 wp14">
+  <w:p>
+    <w:pPr>
+      <w:pStyle w:val="Footer"/>
+      <w:spacing w:before="40"/>
+      <w:jc w:val="left"/>
+      <w:pBdr>
+        <w:top w:val="single" w:sz="4" w:space="2" w:color="808080"/>
+      </w:pBdr>
+    </w:pPr>
+    <w:r/>
+    <w:r>
+      <w:rPr>
+        <w:rFonts w:ascii="Arial" w:hAnsi="Arial"/>
+        <w:color w:val="555555"/>
+        <w:sz w:val="20"/>
+      </w:rPr>
+      <w:t>Revision 1 — June 2026</w:t>
+    </w:r>
+    <w:r>
+      <w:rPr>
+        <w:rFonts w:ascii="Arial" w:hAnsi="Arial"/>
+      </w:rPr>
+      <w:tab/>
+      <w:tab/>
+    </w:r>
+    <w:r>
+      <w:rPr>
+        <w:rFonts w:ascii="Arial" w:hAnsi="Arial"/>
+        <w:color w:val="555555"/>
+        <w:sz w:val="20"/>
+      </w:rPr>
+      <w:t>7-</w:t>
+    </w:r>
+    <w:r>
+      <w:rPr>
+        <w:rFonts w:ascii="Arial" w:hAnsi="Arial"/>
+        <w:color w:val="555555"/>
+        <w:sz w:val="20"/>
+      </w:rPr>
+      <w:fldChar w:fldCharType="begin"/>
+      <w:instrText xml:space="preserve"> PAGE </w:instrText>
+      <w:fldChar w:fldCharType="separate"/>
+      <w:t>1</w:t>
+      <w:fldChar w:fldCharType="end"/>
+    </w:r>
+  </w:p>
+</w:ftr>
+</file>
+
+<file path=word/footer109.xml><?xml version="1.0" encoding="utf-8"?>
+<w:ftr xmlns:m="http://schemas.openxmlformats.org/officeDocument/2006/math" xmlns:mc="http://schemas.openxmlformats.org/markup-compatibility/2006" xmlns:mo="http://schemas.microsoft.com/office/mac/office/2008/main" xmlns:mv="urn:schemas-microsoft-com:mac:vml" xmlns:o="urn:schemas-microsoft-com:office:office" xmlns:r="http://schemas.openxmlformats.org/officeDocument/2006/relationships" xmlns:v="urn:schemas-microsoft-com:vml" xmlns:w10="urn:schemas-microsoft-com:office:word" xmlns:w14="http://schemas.microsoft.com/office/word/2010/wordml" xmlns:w="http://schemas.openxmlformats.org/wordprocessingml/2006/main" xmlns:wne="http://schemas.microsoft.com/office/word/2006/wordml" xmlns:wp14="http://schemas.microsoft.com/office/word/2010/wordprocessingDrawing" xmlns:wp="http://schemas.openxmlformats.org/drawingml/2006/wordprocessingDrawing" xmlns:wpc="http://schemas.microsoft.com/office/word/2010/wordprocessingCanvas" xmlns:wpg="http://schemas.microsoft.com/office/word/2010/wordprocessingGroup" xmlns:wpi="http://schemas.microsoft.com/office/word/2010/wordprocessingInk" xmlns:wps="http://schemas.microsoft.com/office/word/2010/wordprocessingShape" mc:Ignorable="w14 wp14">
+  <w:p>
+    <w:pPr>
+      <w:pStyle w:val="Footer"/>
+      <w:spacing w:before="40"/>
+      <w:jc w:val="left"/>
+      <w:pBdr>
+        <w:top w:val="single" w:sz="4" w:space="2" w:color="808080"/>
+      </w:pBdr>
+    </w:pPr>
+    <w:r/>
+    <w:r>
+      <w:rPr>
+        <w:rFonts w:ascii="Arial" w:hAnsi="Arial"/>
+        <w:color w:val="555555"/>
+        <w:sz w:val="20"/>
+      </w:rPr>
+      <w:t>Revision 1 — June 2026</w:t>
+    </w:r>
+    <w:r>
+      <w:rPr>
+        <w:rFonts w:ascii="Arial" w:hAnsi="Arial"/>
+      </w:rPr>
+      <w:tab/>
+      <w:tab/>
+    </w:r>
+    <w:r>
+      <w:rPr>
+        <w:rFonts w:ascii="Arial" w:hAnsi="Arial"/>
+        <w:color w:val="555555"/>
+        <w:sz w:val="20"/>
+      </w:rPr>
+      <w:t>8-</w:t>
+    </w:r>
+    <w:r>
+      <w:rPr>
+        <w:rFonts w:ascii="Arial" w:hAnsi="Arial"/>
+        <w:color w:val="555555"/>
+        <w:sz w:val="20"/>
+      </w:rPr>
+      <w:fldChar w:fldCharType="begin"/>
+      <w:instrText xml:space="preserve"> PAGE </w:instrText>
+      <w:fldChar w:fldCharType="separate"/>
+      <w:t>1</w:t>
+      <w:fldChar w:fldCharType="end"/>
+    </w:r>
+  </w:p>
+</w:ftr>
+</file>
+
+<file path=word/footer11.xml><?xml version="1.0" encoding="utf-8"?>
+<w:ftr xmlns:m="http://schemas.openxmlformats.org/officeDocument/2006/math" xmlns:mc="http://schemas.openxmlformats.org/markup-compatibility/2006" xmlns:mo="http://schemas.microsoft.com/office/mac/office/2008/main" xmlns:mv="urn:schemas-microsoft-com:mac:vml" xmlns:o="urn:schemas-microsoft-com:office:office" xmlns:r="http://schemas.openxmlformats.org/officeDocument/2006/relationships" xmlns:v="urn:schemas-microsoft-com:vml" xmlns:w10="urn:schemas-microsoft-com:office:word" xmlns:w14="http://schemas.microsoft.com/office/word/2010/wordml" xmlns:w="http://schemas.openxmlformats.org/wordprocessingml/2006/main" xmlns:wne="http://schemas.microsoft.com/office/word/2006/wordml" xmlns:wp14="http://schemas.microsoft.com/office/word/2010/wordprocessingDrawing" xmlns:wp="http://schemas.openxmlformats.org/drawingml/2006/wordprocessingDrawing" xmlns:wpc="http://schemas.microsoft.com/office/word/2010/wordprocessingCanvas" xmlns:wpg="http://schemas.microsoft.com/office/word/2010/wordprocessingGroup" xmlns:wpi="http://schemas.microsoft.com/office/word/2010/wordprocessingInk" xmlns:wps="http://schemas.microsoft.com/office/word/2010/wordprocessingShape" mc:Ignorable="w14 wp14">
+  <w:p>
+    <w:pPr>
+      <w:pStyle w:val="Footer"/>
+      <w:spacing w:before="40"/>
+      <w:jc w:val="left"/>
+      <w:pBdr>
+        <w:top w:val="single" w:sz="4" w:space="2" w:color="808080"/>
+      </w:pBdr>
+    </w:pPr>
+    <w:r/>
+    <w:r>
+      <w:rPr>
+        <w:rFonts w:ascii="Arial" w:hAnsi="Arial"/>
+        <w:color w:val="555555"/>
+        <w:sz w:val="20"/>
+      </w:rPr>
+      <w:t>Revision 1 — June 2026</w:t>
+    </w:r>
+    <w:r>
+      <w:rPr>
+        <w:rFonts w:ascii="Arial" w:hAnsi="Arial"/>
+      </w:rPr>
+      <w:tab/>
+      <w:tab/>
+    </w:r>
+    <w:r>
+      <w:rPr>
+        <w:rFonts w:ascii="Arial" w:hAnsi="Arial"/>
+        <w:color w:val="555555"/>
+        <w:sz w:val="20"/>
+      </w:rPr>
+      <w:t>8-</w:t>
+    </w:r>
+    <w:r>
+      <w:rPr>
+        <w:rFonts w:ascii="Arial" w:hAnsi="Arial"/>
+        <w:color w:val="555555"/>
+        <w:sz w:val="20"/>
+      </w:rPr>
+      <w:fldChar w:fldCharType="begin"/>
+      <w:instrText xml:space="preserve"> PAGE </w:instrText>
+      <w:fldChar w:fldCharType="separate"/>
+      <w:t>1</w:t>
+      <w:fldChar w:fldCharType="end"/>
+    </w:r>
+  </w:p>
+</w:ftr>
+</file>
+
+<file path=word/footer110.xml><?xml version="1.0" encoding="utf-8"?>
+<w:ftr xmlns:m="http://schemas.openxmlformats.org/officeDocument/2006/math" xmlns:mc="http://schemas.openxmlformats.org/markup-compatibility/2006" xmlns:mo="http://schemas.microsoft.com/office/mac/office/2008/main" xmlns:mv="urn:schemas-microsoft-com:mac:vml" xmlns:o="urn:schemas-microsoft-com:office:office" xmlns:r="http://schemas.openxmlformats.org/officeDocument/2006/relationships" xmlns:v="urn:schemas-microsoft-com:vml" xmlns:w10="urn:schemas-microsoft-com:office:word" xmlns:w14="http://schemas.microsoft.com/office/word/2010/wordml" xmlns:w="http://schemas.openxmlformats.org/wordprocessingml/2006/main" xmlns:wne="http://schemas.microsoft.com/office/word/2006/wordml" xmlns:wp14="http://schemas.microsoft.com/office/word/2010/wordprocessingDrawing" xmlns:wp="http://schemas.openxmlformats.org/drawingml/2006/wordprocessingDrawing" xmlns:wpc="http://schemas.microsoft.com/office/word/2010/wordprocessingCanvas" xmlns:wpg="http://schemas.microsoft.com/office/word/2010/wordprocessingGroup" xmlns:wpi="http://schemas.microsoft.com/office/word/2010/wordprocessingInk" xmlns:wps="http://schemas.microsoft.com/office/word/2010/wordprocessingShape" mc:Ignorable="w14 wp14">
+  <w:p>
+    <w:pPr>
+      <w:pStyle w:val="Footer"/>
+      <w:spacing w:before="40"/>
+      <w:jc w:val="left"/>
+      <w:pBdr>
+        <w:top w:val="single" w:sz="4" w:space="2" w:color="808080"/>
+      </w:pBdr>
+    </w:pPr>
+    <w:r/>
+    <w:r>
+      <w:rPr>
+        <w:rFonts w:ascii="Arial" w:hAnsi="Arial"/>
+        <w:color w:val="555555"/>
+        <w:sz w:val="20"/>
+      </w:rPr>
+      <w:t>Revision 1 — June 2026</w:t>
+    </w:r>
+    <w:r>
+      <w:rPr>
+        <w:rFonts w:ascii="Arial" w:hAnsi="Arial"/>
+      </w:rPr>
+      <w:tab/>
+      <w:tab/>
+    </w:r>
+    <w:r>
+      <w:rPr>
+        <w:rFonts w:ascii="Arial" w:hAnsi="Arial"/>
+        <w:color w:val="555555"/>
+        <w:sz w:val="20"/>
+      </w:rPr>
+      <w:t>9-</w:t>
+    </w:r>
+    <w:r>
+      <w:rPr>
+        <w:rFonts w:ascii="Arial" w:hAnsi="Arial"/>
+        <w:color w:val="555555"/>
+        <w:sz w:val="20"/>
+      </w:rPr>
+      <w:fldChar w:fldCharType="begin"/>
+      <w:instrText xml:space="preserve"> PAGE </w:instrText>
+      <w:fldChar w:fldCharType="separate"/>
+      <w:t>1</w:t>
+      <w:fldChar w:fldCharType="end"/>
+    </w:r>
+  </w:p>
+</w:ftr>
+</file>
+
+<file path=word/footer111.xml><?xml version="1.0" encoding="utf-8"?>
+<w:ftr xmlns:m="http://schemas.openxmlformats.org/officeDocument/2006/math" xmlns:mc="http://schemas.openxmlformats.org/markup-compatibility/2006" xmlns:mo="http://schemas.microsoft.com/office/mac/office/2008/main" xmlns:mv="urn:schemas-microsoft-com:mac:vml" xmlns:o="urn:schemas-microsoft-com:office:office" xmlns:r="http://schemas.openxmlformats.org/officeDocument/2006/relationships" xmlns:v="urn:schemas-microsoft-com:vml" xmlns:w10="urn:schemas-microsoft-com:office:word" xmlns:w14="http://schemas.microsoft.com/office/word/2010/wordml" xmlns:w="http://schemas.openxmlformats.org/wordprocessingml/2006/main" xmlns:wne="http://schemas.microsoft.com/office/word/2006/wordml" xmlns:wp14="http://schemas.microsoft.com/office/word/2010/wordprocessingDrawing" xmlns:wp="http://schemas.openxmlformats.org/drawingml/2006/wordprocessingDrawing" xmlns:wpc="http://schemas.microsoft.com/office/word/2010/wordprocessingCanvas" xmlns:wpg="http://schemas.microsoft.com/office/word/2010/wordprocessingGroup" xmlns:wpi="http://schemas.microsoft.com/office/word/2010/wordprocessingInk" xmlns:wps="http://schemas.microsoft.com/office/word/2010/wordprocessingShape" mc:Ignorable="w14 wp14">
+  <w:p>
+    <w:pPr>
+      <w:pStyle w:val="Footer"/>
+      <w:spacing w:before="40"/>
+      <w:jc w:val="left"/>
+      <w:pBdr>
+        <w:top w:val="single" w:sz="4" w:space="2" w:color="808080"/>
+      </w:pBdr>
+    </w:pPr>
+    <w:r/>
+    <w:r>
+      <w:rPr>
+        <w:rFonts w:ascii="Arial" w:hAnsi="Arial"/>
+        <w:color w:val="555555"/>
+        <w:sz w:val="20"/>
+      </w:rPr>
+      <w:t>Revision 1 — June 2026</w:t>
+    </w:r>
+    <w:r>
+      <w:rPr>
+        <w:rFonts w:ascii="Arial" w:hAnsi="Arial"/>
+      </w:rPr>
+      <w:tab/>
+      <w:tab/>
+    </w:r>
+    <w:r>
+      <w:rPr>
+        <w:rFonts w:ascii="Arial" w:hAnsi="Arial"/>
+        <w:color w:val="555555"/>
+        <w:sz w:val="20"/>
+      </w:rPr>
+      <w:t>10-</w:t>
+    </w:r>
+    <w:r>
+      <w:rPr>
+        <w:rFonts w:ascii="Arial" w:hAnsi="Arial"/>
+        <w:color w:val="555555"/>
+        <w:sz w:val="20"/>
+      </w:rPr>
+      <w:fldChar w:fldCharType="begin"/>
+      <w:instrText xml:space="preserve"> PAGE </w:instrText>
+      <w:fldChar w:fldCharType="separate"/>
+      <w:t>1</w:t>
+      <w:fldChar w:fldCharType="end"/>
+    </w:r>
+  </w:p>
+</w:ftr>
+</file>
+
+<file path=word/footer112.xml><?xml version="1.0" encoding="utf-8"?>
+<w:ftr xmlns:m="http://schemas.openxmlformats.org/officeDocument/2006/math" xmlns:mc="http://schemas.openxmlformats.org/markup-compatibility/2006" xmlns:mo="http://schemas.microsoft.com/office/mac/office/2008/main" xmlns:mv="urn:schemas-microsoft-com:mac:vml" xmlns:o="urn:schemas-microsoft-com:office:office" xmlns:r="http://schemas.openxmlformats.org/officeDocument/2006/relationships" xmlns:v="urn:schemas-microsoft-com:vml" xmlns:w10="urn:schemas-microsoft-com:office:word" xmlns:w14="http://schemas.microsoft.com/office/word/2010/wordml" xmlns:w="http://schemas.openxmlformats.org/wordprocessingml/2006/main" xmlns:wne="http://schemas.microsoft.com/office/word/2006/wordml" xmlns:wp14="http://schemas.microsoft.com/office/word/2010/wordprocessingDrawing" xmlns:wp="http://schemas.openxmlformats.org/drawingml/2006/wordprocessingDrawing" xmlns:wpc="http://schemas.microsoft.com/office/word/2010/wordprocessingCanvas" xmlns:wpg="http://schemas.microsoft.com/office/word/2010/wordprocessingGroup" xmlns:wpi="http://schemas.microsoft.com/office/word/2010/wordprocessingInk" xmlns:wps="http://schemas.microsoft.com/office/word/2010/wordprocessingShape" mc:Ignorable="w14 wp14">
+  <w:p>
+    <w:pPr>
+      <w:pStyle w:val="Footer"/>
+      <w:spacing w:before="40"/>
+      <w:jc w:val="left"/>
+      <w:pBdr>
+        <w:top w:val="single" w:sz="4" w:space="2" w:color="808080"/>
+      </w:pBdr>
+    </w:pPr>
+    <w:r/>
+    <w:r>
+      <w:rPr>
+        <w:rFonts w:ascii="Arial" w:hAnsi="Arial"/>
+        <w:color w:val="555555"/>
+        <w:sz w:val="20"/>
+      </w:rPr>
+      <w:t>Revision 1 — June 2026</w:t>
+    </w:r>
+    <w:r>
+      <w:rPr>
+        <w:rFonts w:ascii="Arial" w:hAnsi="Arial"/>
+      </w:rPr>
+      <w:tab/>
+      <w:tab/>
+    </w:r>
+    <w:r>
+      <w:rPr>
+        <w:rFonts w:ascii="Arial" w:hAnsi="Arial"/>
+        <w:color w:val="555555"/>
+        <w:sz w:val="20"/>
+      </w:rPr>
+      <w:t>11-</w:t>
+    </w:r>
+    <w:r>
+      <w:rPr>
+        <w:rFonts w:ascii="Arial" w:hAnsi="Arial"/>
+        <w:color w:val="555555"/>
+        <w:sz w:val="20"/>
+      </w:rPr>
+      <w:fldChar w:fldCharType="begin"/>
+      <w:instrText xml:space="preserve"> PAGE </w:instrText>
+      <w:fldChar w:fldCharType="separate"/>
+      <w:t>1</w:t>
+      <w:fldChar w:fldCharType="end"/>
+    </w:r>
+  </w:p>
+</w:ftr>
+</file>
+
+<file path=word/footer113.xml><?xml version="1.0" encoding="utf-8"?>
+<w:ftr xmlns:m="http://schemas.openxmlformats.org/officeDocument/2006/math" xmlns:mc="http://schemas.openxmlformats.org/markup-compatibility/2006" xmlns:mo="http://schemas.microsoft.com/office/mac/office/2008/main" xmlns:mv="urn:schemas-microsoft-com:mac:vml" xmlns:o="urn:schemas-microsoft-com:office:office" xmlns:r="http://schemas.openxmlformats.org/officeDocument/2006/relationships" xmlns:v="urn:schemas-microsoft-com:vml" xmlns:w10="urn:schemas-microsoft-com:office:word" xmlns:w14="http://schemas.microsoft.com/office/word/2010/wordml" xmlns:w="http://schemas.openxmlformats.org/wordprocessingml/2006/main" xmlns:wne="http://schemas.microsoft.com/office/word/2006/wordml" xmlns:wp14="http://schemas.microsoft.com/office/word/2010/wordprocessingDrawing" xmlns:wp="http://schemas.openxmlformats.org/drawingml/2006/wordprocessingDrawing" xmlns:wpc="http://schemas.microsoft.com/office/word/2010/wordprocessingCanvas" xmlns:wpg="http://schemas.microsoft.com/office/word/2010/wordprocessingGroup" xmlns:wpi="http://schemas.microsoft.com/office/word/2010/wordprocessingInk" xmlns:wps="http://schemas.microsoft.com/office/word/2010/wordprocessingShape" mc:Ignorable="w14 wp14">
+  <w:p>
+    <w:pPr>
+      <w:pStyle w:val="Footer"/>
+      <w:spacing w:before="40"/>
+      <w:jc w:val="left"/>
+      <w:pBdr>
+        <w:top w:val="single" w:sz="4" w:space="2" w:color="808080"/>
+      </w:pBdr>
+    </w:pPr>
+    <w:r/>
+    <w:r>
+      <w:rPr>
+        <w:rFonts w:ascii="Arial" w:hAnsi="Arial"/>
+        <w:color w:val="555555"/>
+        <w:sz w:val="20"/>
+      </w:rPr>
+      <w:t>Revision 1 — June 2026</w:t>
     </w:r>
   </w:p>
 </w:ftr>
@@ -9814,14 +10493,6 @@
       </w:pBdr>
     </w:pPr>
     <w:r/>
-    <w:r>
-      <w:rPr>
-        <w:rFonts w:ascii="Arial" w:hAnsi="Arial"/>
-        <w:color w:val="555555"/>
-        <w:sz w:val="20"/>
-      </w:rPr>
-      <w:t>Revision 1 — June 2026</w:t>
-    </w:r>
   </w:p>
 </w:ftr>
 </file>
@@ -9862,7 +10533,7 @@
 </w:hdr>
 </file>
 
-<file path=word/header11.xml><?xml version="1.0" encoding="utf-8"?>
+<file path=word/header100.xml><?xml version="1.0" encoding="utf-8"?>
 <w:hdr xmlns:m="http://schemas.openxmlformats.org/officeDocument/2006/math" xmlns:mc="http://schemas.openxmlformats.org/markup-compatibility/2006" xmlns:mo="http://schemas.microsoft.com/office/mac/office/2008/main" xmlns:mv="urn:schemas-microsoft-com:mac:vml" xmlns:o="urn:schemas-microsoft-com:office:office" xmlns:r="http://schemas.openxmlformats.org/officeDocument/2006/relationships" xmlns:v="urn:schemas-microsoft-com:vml" xmlns:w10="urn:schemas-microsoft-com:office:word" xmlns:w14="http://schemas.microsoft.com/office/word/2010/wordml" xmlns:w="http://schemas.openxmlformats.org/wordprocessingml/2006/main" xmlns:wne="http://schemas.microsoft.com/office/word/2006/wordml" xmlns:wp14="http://schemas.microsoft.com/office/word/2010/wordprocessingDrawing" xmlns:wp="http://schemas.openxmlformats.org/drawingml/2006/wordprocessingDrawing" xmlns:wpc="http://schemas.microsoft.com/office/word/2010/wordprocessingCanvas" xmlns:wpg="http://schemas.microsoft.com/office/word/2010/wordprocessingGroup" xmlns:wpi="http://schemas.microsoft.com/office/word/2010/wordprocessingInk" xmlns:wps="http://schemas.microsoft.com/office/word/2010/wordprocessingShape" mc:Ignorable="w14 wp14">
   <w:p>
     <w:pPr>
@@ -9881,7 +10552,357 @@
         <w:color w:val="555555"/>
         <w:sz w:val="20"/>
       </w:rPr>
+      <w:t>Table of Contents</w:t>
+    </w:r>
+  </w:p>
+</w:hdr>
+</file>
+
+<file path=word/header101.xml><?xml version="1.0" encoding="utf-8"?>
+<w:hdr xmlns:m="http://schemas.openxmlformats.org/officeDocument/2006/math" xmlns:mc="http://schemas.openxmlformats.org/markup-compatibility/2006" xmlns:mo="http://schemas.microsoft.com/office/mac/office/2008/main" xmlns:mv="urn:schemas-microsoft-com:mac:vml" xmlns:o="urn:schemas-microsoft-com:office:office" xmlns:r="http://schemas.openxmlformats.org/officeDocument/2006/relationships" xmlns:v="urn:schemas-microsoft-com:vml" xmlns:w10="urn:schemas-microsoft-com:office:word" xmlns:w14="http://schemas.microsoft.com/office/word/2010/wordml" xmlns:w="http://schemas.openxmlformats.org/wordprocessingml/2006/main" xmlns:wne="http://schemas.microsoft.com/office/word/2006/wordml" xmlns:wp14="http://schemas.microsoft.com/office/word/2010/wordprocessingDrawing" xmlns:wp="http://schemas.openxmlformats.org/drawingml/2006/wordprocessingDrawing" xmlns:wpc="http://schemas.microsoft.com/office/word/2010/wordprocessingCanvas" xmlns:wpg="http://schemas.microsoft.com/office/word/2010/wordprocessingGroup" xmlns:wpi="http://schemas.microsoft.com/office/word/2010/wordprocessingInk" xmlns:wps="http://schemas.microsoft.com/office/word/2010/wordprocessingShape" mc:Ignorable="w14 wp14">
+  <w:p>
+    <w:pPr>
+      <w:pStyle w:val="Header"/>
+      <w:spacing w:after="40"/>
+      <w:jc w:val="right"/>
+      <w:pBdr>
+        <w:bottom w:val="single" w:sz="4" w:space="2" w:color="808080"/>
+      </w:pBdr>
+    </w:pPr>
+    <w:r/>
+    <w:r>
+      <w:rPr>
+        <w:rFonts w:ascii="Arial" w:hAnsi="Arial"/>
+        <w:b/>
+        <w:color w:val="555555"/>
+        <w:sz w:val="20"/>
+      </w:rPr>
+      <w:t>Quick Start</w:t>
+    </w:r>
+  </w:p>
+</w:hdr>
+</file>
+
+<file path=word/header102.xml><?xml version="1.0" encoding="utf-8"?>
+<w:hdr xmlns:m="http://schemas.openxmlformats.org/officeDocument/2006/math" xmlns:mc="http://schemas.openxmlformats.org/markup-compatibility/2006" xmlns:mo="http://schemas.microsoft.com/office/mac/office/2008/main" xmlns:mv="urn:schemas-microsoft-com:mac:vml" xmlns:o="urn:schemas-microsoft-com:office:office" xmlns:r="http://schemas.openxmlformats.org/officeDocument/2006/relationships" xmlns:v="urn:schemas-microsoft-com:vml" xmlns:w10="urn:schemas-microsoft-com:office:word" xmlns:w14="http://schemas.microsoft.com/office/word/2010/wordml" xmlns:w="http://schemas.openxmlformats.org/wordprocessingml/2006/main" xmlns:wne="http://schemas.microsoft.com/office/word/2006/wordml" xmlns:wp14="http://schemas.microsoft.com/office/word/2010/wordprocessingDrawing" xmlns:wp="http://schemas.openxmlformats.org/drawingml/2006/wordprocessingDrawing" xmlns:wpc="http://schemas.microsoft.com/office/word/2010/wordprocessingCanvas" xmlns:wpg="http://schemas.microsoft.com/office/word/2010/wordprocessingGroup" xmlns:wpi="http://schemas.microsoft.com/office/word/2010/wordprocessingInk" xmlns:wps="http://schemas.microsoft.com/office/word/2010/wordprocessingShape" mc:Ignorable="w14 wp14">
+  <w:p>
+    <w:pPr>
+      <w:pStyle w:val="Header"/>
+      <w:spacing w:after="40"/>
+      <w:jc w:val="right"/>
+      <w:pBdr>
+        <w:bottom w:val="single" w:sz="4" w:space="2" w:color="808080"/>
+      </w:pBdr>
+    </w:pPr>
+    <w:r/>
+    <w:r>
+      <w:rPr>
+        <w:rFonts w:ascii="Arial" w:hAnsi="Arial"/>
+        <w:b/>
+        <w:color w:val="555555"/>
+        <w:sz w:val="20"/>
+      </w:rPr>
+      <w:t>1. Overview</w:t>
+    </w:r>
+  </w:p>
+</w:hdr>
+</file>
+
+<file path=word/header103.xml><?xml version="1.0" encoding="utf-8"?>
+<w:hdr xmlns:m="http://schemas.openxmlformats.org/officeDocument/2006/math" xmlns:mc="http://schemas.openxmlformats.org/markup-compatibility/2006" xmlns:mo="http://schemas.microsoft.com/office/mac/office/2008/main" xmlns:mv="urn:schemas-microsoft-com:mac:vml" xmlns:o="urn:schemas-microsoft-com:office:office" xmlns:r="http://schemas.openxmlformats.org/officeDocument/2006/relationships" xmlns:v="urn:schemas-microsoft-com:vml" xmlns:w10="urn:schemas-microsoft-com:office:word" xmlns:w14="http://schemas.microsoft.com/office/word/2010/wordml" xmlns:w="http://schemas.openxmlformats.org/wordprocessingml/2006/main" xmlns:wne="http://schemas.microsoft.com/office/word/2006/wordml" xmlns:wp14="http://schemas.microsoft.com/office/word/2010/wordprocessingDrawing" xmlns:wp="http://schemas.openxmlformats.org/drawingml/2006/wordprocessingDrawing" xmlns:wpc="http://schemas.microsoft.com/office/word/2010/wordprocessingCanvas" xmlns:wpg="http://schemas.microsoft.com/office/word/2010/wordprocessingGroup" xmlns:wpi="http://schemas.microsoft.com/office/word/2010/wordprocessingInk" xmlns:wps="http://schemas.microsoft.com/office/word/2010/wordprocessingShape" mc:Ignorable="w14 wp14">
+  <w:p>
+    <w:pPr>
+      <w:pStyle w:val="Header"/>
+      <w:spacing w:after="40"/>
+      <w:jc w:val="right"/>
+      <w:pBdr>
+        <w:bottom w:val="single" w:sz="4" w:space="2" w:color="808080"/>
+      </w:pBdr>
+    </w:pPr>
+    <w:r/>
+    <w:r>
+      <w:rPr>
+        <w:rFonts w:ascii="Arial" w:hAnsi="Arial"/>
+        <w:b/>
+        <w:color w:val="555555"/>
+        <w:sz w:val="20"/>
+      </w:rPr>
+      <w:t>2. Theory of Operation</w:t>
+    </w:r>
+  </w:p>
+</w:hdr>
+</file>
+
+<file path=word/header104.xml><?xml version="1.0" encoding="utf-8"?>
+<w:hdr xmlns:m="http://schemas.openxmlformats.org/officeDocument/2006/math" xmlns:mc="http://schemas.openxmlformats.org/markup-compatibility/2006" xmlns:mo="http://schemas.microsoft.com/office/mac/office/2008/main" xmlns:mv="urn:schemas-microsoft-com:mac:vml" xmlns:o="urn:schemas-microsoft-com:office:office" xmlns:r="http://schemas.openxmlformats.org/officeDocument/2006/relationships" xmlns:v="urn:schemas-microsoft-com:vml" xmlns:w10="urn:schemas-microsoft-com:office:word" xmlns:w14="http://schemas.microsoft.com/office/word/2010/wordml" xmlns:w="http://schemas.openxmlformats.org/wordprocessingml/2006/main" xmlns:wne="http://schemas.microsoft.com/office/word/2006/wordml" xmlns:wp14="http://schemas.microsoft.com/office/word/2010/wordprocessingDrawing" xmlns:wp="http://schemas.openxmlformats.org/drawingml/2006/wordprocessingDrawing" xmlns:wpc="http://schemas.microsoft.com/office/word/2010/wordprocessingCanvas" xmlns:wpg="http://schemas.microsoft.com/office/word/2010/wordprocessingGroup" xmlns:wpi="http://schemas.microsoft.com/office/word/2010/wordprocessingInk" xmlns:wps="http://schemas.microsoft.com/office/word/2010/wordprocessingShape" mc:Ignorable="w14 wp14">
+  <w:p>
+    <w:pPr>
+      <w:pStyle w:val="Header"/>
+      <w:spacing w:after="40"/>
+      <w:jc w:val="right"/>
+      <w:pBdr>
+        <w:bottom w:val="single" w:sz="4" w:space="2" w:color="808080"/>
+      </w:pBdr>
+    </w:pPr>
+    <w:r/>
+    <w:r>
+      <w:rPr>
+        <w:rFonts w:ascii="Arial" w:hAnsi="Arial"/>
+        <w:b/>
+        <w:color w:val="555555"/>
+        <w:sz w:val="20"/>
+      </w:rPr>
+      <w:t>3. Hardware</w:t>
+    </w:r>
+  </w:p>
+</w:hdr>
+</file>
+
+<file path=word/header105.xml><?xml version="1.0" encoding="utf-8"?>
+<w:hdr xmlns:m="http://schemas.openxmlformats.org/officeDocument/2006/math" xmlns:mc="http://schemas.openxmlformats.org/markup-compatibility/2006" xmlns:mo="http://schemas.microsoft.com/office/mac/office/2008/main" xmlns:mv="urn:schemas-microsoft-com:mac:vml" xmlns:o="urn:schemas-microsoft-com:office:office" xmlns:r="http://schemas.openxmlformats.org/officeDocument/2006/relationships" xmlns:v="urn:schemas-microsoft-com:vml" xmlns:w10="urn:schemas-microsoft-com:office:word" xmlns:w14="http://schemas.microsoft.com/office/word/2010/wordml" xmlns:w="http://schemas.openxmlformats.org/wordprocessingml/2006/main" xmlns:wne="http://schemas.microsoft.com/office/word/2006/wordml" xmlns:wp14="http://schemas.microsoft.com/office/word/2010/wordprocessingDrawing" xmlns:wp="http://schemas.openxmlformats.org/drawingml/2006/wordprocessingDrawing" xmlns:wpc="http://schemas.microsoft.com/office/word/2010/wordprocessingCanvas" xmlns:wpg="http://schemas.microsoft.com/office/word/2010/wordprocessingGroup" xmlns:wpi="http://schemas.microsoft.com/office/word/2010/wordprocessingInk" xmlns:wps="http://schemas.microsoft.com/office/word/2010/wordprocessingShape" mc:Ignorable="w14 wp14">
+  <w:p>
+    <w:pPr>
+      <w:pStyle w:val="Header"/>
+      <w:spacing w:after="40"/>
+      <w:jc w:val="right"/>
+      <w:pBdr>
+        <w:bottom w:val="single" w:sz="4" w:space="2" w:color="808080"/>
+      </w:pBdr>
+    </w:pPr>
+    <w:r/>
+    <w:r>
+      <w:rPr>
+        <w:rFonts w:ascii="Arial" w:hAnsi="Arial"/>
+        <w:b/>
+        <w:color w:val="555555"/>
+        <w:sz w:val="20"/>
+      </w:rPr>
+      <w:t>4. First-Time Setup (AP Mode)</w:t>
+    </w:r>
+  </w:p>
+</w:hdr>
+</file>
+
+<file path=word/header106.xml><?xml version="1.0" encoding="utf-8"?>
+<w:hdr xmlns:m="http://schemas.openxmlformats.org/officeDocument/2006/math" xmlns:mc="http://schemas.openxmlformats.org/markup-compatibility/2006" xmlns:mo="http://schemas.microsoft.com/office/mac/office/2008/main" xmlns:mv="urn:schemas-microsoft-com:mac:vml" xmlns:o="urn:schemas-microsoft-com:office:office" xmlns:r="http://schemas.openxmlformats.org/officeDocument/2006/relationships" xmlns:v="urn:schemas-microsoft-com:vml" xmlns:w10="urn:schemas-microsoft-com:office:word" xmlns:w14="http://schemas.microsoft.com/office/word/2010/wordml" xmlns:w="http://schemas.openxmlformats.org/wordprocessingml/2006/main" xmlns:wne="http://schemas.microsoft.com/office/word/2006/wordml" xmlns:wp14="http://schemas.microsoft.com/office/word/2010/wordprocessingDrawing" xmlns:wp="http://schemas.openxmlformats.org/drawingml/2006/wordprocessingDrawing" xmlns:wpc="http://schemas.microsoft.com/office/word/2010/wordprocessingCanvas" xmlns:wpg="http://schemas.microsoft.com/office/word/2010/wordprocessingGroup" xmlns:wpi="http://schemas.microsoft.com/office/word/2010/wordprocessingInk" xmlns:wps="http://schemas.microsoft.com/office/word/2010/wordprocessingShape" mc:Ignorable="w14 wp14">
+  <w:p>
+    <w:pPr>
+      <w:pStyle w:val="Header"/>
+      <w:spacing w:after="40"/>
+      <w:jc w:val="right"/>
+      <w:pBdr>
+        <w:bottom w:val="single" w:sz="4" w:space="2" w:color="808080"/>
+      </w:pBdr>
+    </w:pPr>
+    <w:r/>
+    <w:r>
+      <w:rPr>
+        <w:rFonts w:ascii="Arial" w:hAnsi="Arial"/>
+        <w:b/>
+        <w:color w:val="555555"/>
+        <w:sz w:val="20"/>
+      </w:rPr>
+      <w:t>5. The Status Page</w:t>
+    </w:r>
+  </w:p>
+</w:hdr>
+</file>
+
+<file path=word/header107.xml><?xml version="1.0" encoding="utf-8"?>
+<w:hdr xmlns:m="http://schemas.openxmlformats.org/officeDocument/2006/math" xmlns:mc="http://schemas.openxmlformats.org/markup-compatibility/2006" xmlns:mo="http://schemas.microsoft.com/office/mac/office/2008/main" xmlns:mv="urn:schemas-microsoft-com:mac:vml" xmlns:o="urn:schemas-microsoft-com:office:office" xmlns:r="http://schemas.openxmlformats.org/officeDocument/2006/relationships" xmlns:v="urn:schemas-microsoft-com:vml" xmlns:w10="urn:schemas-microsoft-com:office:word" xmlns:w14="http://schemas.microsoft.com/office/word/2010/wordml" xmlns:w="http://schemas.openxmlformats.org/wordprocessingml/2006/main" xmlns:wne="http://schemas.microsoft.com/office/word/2006/wordml" xmlns:wp14="http://schemas.microsoft.com/office/word/2010/wordprocessingDrawing" xmlns:wp="http://schemas.openxmlformats.org/drawingml/2006/wordprocessingDrawing" xmlns:wpc="http://schemas.microsoft.com/office/word/2010/wordprocessingCanvas" xmlns:wpg="http://schemas.microsoft.com/office/word/2010/wordprocessingGroup" xmlns:wpi="http://schemas.microsoft.com/office/word/2010/wordprocessingInk" xmlns:wps="http://schemas.microsoft.com/office/word/2010/wordprocessingShape" mc:Ignorable="w14 wp14">
+  <w:p>
+    <w:pPr>
+      <w:pStyle w:val="Header"/>
+      <w:spacing w:after="40"/>
+      <w:jc w:val="right"/>
+      <w:pBdr>
+        <w:bottom w:val="single" w:sz="4" w:space="2" w:color="808080"/>
+      </w:pBdr>
+    </w:pPr>
+    <w:r/>
+    <w:r>
+      <w:rPr>
+        <w:rFonts w:ascii="Arial" w:hAnsi="Arial"/>
+        <w:b/>
+        <w:color w:val="555555"/>
+        <w:sz w:val="20"/>
+      </w:rPr>
+      <w:t>6. Settings Reference</w:t>
+    </w:r>
+  </w:p>
+</w:hdr>
+</file>
+
+<file path=word/header108.xml><?xml version="1.0" encoding="utf-8"?>
+<w:hdr xmlns:m="http://schemas.openxmlformats.org/officeDocument/2006/math" xmlns:mc="http://schemas.openxmlformats.org/markup-compatibility/2006" xmlns:mo="http://schemas.microsoft.com/office/mac/office/2008/main" xmlns:mv="urn:schemas-microsoft-com:mac:vml" xmlns:o="urn:schemas-microsoft-com:office:office" xmlns:r="http://schemas.openxmlformats.org/officeDocument/2006/relationships" xmlns:v="urn:schemas-microsoft-com:vml" xmlns:w10="urn:schemas-microsoft-com:office:word" xmlns:w14="http://schemas.microsoft.com/office/word/2010/wordml" xmlns:w="http://schemas.openxmlformats.org/wordprocessingml/2006/main" xmlns:wne="http://schemas.microsoft.com/office/word/2006/wordml" xmlns:wp14="http://schemas.microsoft.com/office/word/2010/wordprocessingDrawing" xmlns:wp="http://schemas.openxmlformats.org/drawingml/2006/wordprocessingDrawing" xmlns:wpc="http://schemas.microsoft.com/office/word/2010/wordprocessingCanvas" xmlns:wpg="http://schemas.microsoft.com/office/word/2010/wordprocessingGroup" xmlns:wpi="http://schemas.microsoft.com/office/word/2010/wordprocessingInk" xmlns:wps="http://schemas.microsoft.com/office/word/2010/wordprocessingShape" mc:Ignorable="w14 wp14">
+  <w:p>
+    <w:pPr>
+      <w:pStyle w:val="Header"/>
+      <w:spacing w:after="40"/>
+      <w:jc w:val="right"/>
+      <w:pBdr>
+        <w:bottom w:val="single" w:sz="4" w:space="2" w:color="808080"/>
+      </w:pBdr>
+    </w:pPr>
+    <w:r/>
+    <w:r>
+      <w:rPr>
+        <w:rFonts w:ascii="Arial" w:hAnsi="Arial"/>
+        <w:b/>
+        <w:color w:val="555555"/>
+        <w:sz w:val="20"/>
+      </w:rPr>
+      <w:t>7. Indicator LEDs and Under-light</w:t>
+    </w:r>
+  </w:p>
+</w:hdr>
+</file>
+
+<file path=word/header109.xml><?xml version="1.0" encoding="utf-8"?>
+<w:hdr xmlns:m="http://schemas.openxmlformats.org/officeDocument/2006/math" xmlns:mc="http://schemas.openxmlformats.org/markup-compatibility/2006" xmlns:mo="http://schemas.microsoft.com/office/mac/office/2008/main" xmlns:mv="urn:schemas-microsoft-com:mac:vml" xmlns:o="urn:schemas-microsoft-com:office:office" xmlns:r="http://schemas.openxmlformats.org/officeDocument/2006/relationships" xmlns:v="urn:schemas-microsoft-com:vml" xmlns:w10="urn:schemas-microsoft-com:office:word" xmlns:w14="http://schemas.microsoft.com/office/word/2010/wordml" xmlns:w="http://schemas.openxmlformats.org/wordprocessingml/2006/main" xmlns:wne="http://schemas.microsoft.com/office/word/2006/wordml" xmlns:wp14="http://schemas.microsoft.com/office/word/2010/wordprocessingDrawing" xmlns:wp="http://schemas.openxmlformats.org/drawingml/2006/wordprocessingDrawing" xmlns:wpc="http://schemas.microsoft.com/office/word/2010/wordprocessingCanvas" xmlns:wpg="http://schemas.microsoft.com/office/word/2010/wordprocessingGroup" xmlns:wpi="http://schemas.microsoft.com/office/word/2010/wordprocessingInk" xmlns:wps="http://schemas.microsoft.com/office/word/2010/wordprocessingShape" mc:Ignorable="w14 wp14">
+  <w:p>
+    <w:pPr>
+      <w:pStyle w:val="Header"/>
+      <w:spacing w:after="40"/>
+      <w:jc w:val="right"/>
+      <w:pBdr>
+        <w:bottom w:val="single" w:sz="4" w:space="2" w:color="808080"/>
+      </w:pBdr>
+    </w:pPr>
+    <w:r/>
+    <w:r>
+      <w:rPr>
+        <w:rFonts w:ascii="Arial" w:hAnsi="Arial"/>
+        <w:b/>
+        <w:color w:val="555555"/>
+        <w:sz w:val="20"/>
+      </w:rPr>
       <w:t>8. The SW1 Button</w:t>
+    </w:r>
+  </w:p>
+</w:hdr>
+</file>
+
+<file path=word/header11.xml><?xml version="1.0" encoding="utf-8"?>
+<w:hdr xmlns:m="http://schemas.openxmlformats.org/officeDocument/2006/math" xmlns:mc="http://schemas.openxmlformats.org/markup-compatibility/2006" xmlns:mo="http://schemas.microsoft.com/office/mac/office/2008/main" xmlns:mv="urn:schemas-microsoft-com:mac:vml" xmlns:o="urn:schemas-microsoft-com:office:office" xmlns:r="http://schemas.openxmlformats.org/officeDocument/2006/relationships" xmlns:v="urn:schemas-microsoft-com:vml" xmlns:w10="urn:schemas-microsoft-com:office:word" xmlns:w14="http://schemas.microsoft.com/office/word/2010/wordml" xmlns:w="http://schemas.openxmlformats.org/wordprocessingml/2006/main" xmlns:wne="http://schemas.microsoft.com/office/word/2006/wordml" xmlns:wp14="http://schemas.microsoft.com/office/word/2010/wordprocessingDrawing" xmlns:wp="http://schemas.openxmlformats.org/drawingml/2006/wordprocessingDrawing" xmlns:wpc="http://schemas.microsoft.com/office/word/2010/wordprocessingCanvas" xmlns:wpg="http://schemas.microsoft.com/office/word/2010/wordprocessingGroup" xmlns:wpi="http://schemas.microsoft.com/office/word/2010/wordprocessingInk" xmlns:wps="http://schemas.microsoft.com/office/word/2010/wordprocessingShape" mc:Ignorable="w14 wp14">
+  <w:p>
+    <w:pPr>
+      <w:pStyle w:val="Header"/>
+      <w:spacing w:after="40"/>
+      <w:jc w:val="right"/>
+      <w:pBdr>
+        <w:bottom w:val="single" w:sz="4" w:space="2" w:color="808080"/>
+      </w:pBdr>
+    </w:pPr>
+    <w:r/>
+    <w:r>
+      <w:rPr>
+        <w:rFonts w:ascii="Arial" w:hAnsi="Arial"/>
+        <w:b/>
+        <w:color w:val="555555"/>
+        <w:sz w:val="20"/>
+      </w:rPr>
+      <w:t>8. The SW1 Button</w:t>
+    </w:r>
+  </w:p>
+</w:hdr>
+</file>
+
+<file path=word/header110.xml><?xml version="1.0" encoding="utf-8"?>
+<w:hdr xmlns:m="http://schemas.openxmlformats.org/officeDocument/2006/math" xmlns:mc="http://schemas.openxmlformats.org/markup-compatibility/2006" xmlns:mo="http://schemas.microsoft.com/office/mac/office/2008/main" xmlns:mv="urn:schemas-microsoft-com:mac:vml" xmlns:o="urn:schemas-microsoft-com:office:office" xmlns:r="http://schemas.openxmlformats.org/officeDocument/2006/relationships" xmlns:v="urn:schemas-microsoft-com:vml" xmlns:w10="urn:schemas-microsoft-com:office:word" xmlns:w14="http://schemas.microsoft.com/office/word/2010/wordml" xmlns:w="http://schemas.openxmlformats.org/wordprocessingml/2006/main" xmlns:wne="http://schemas.microsoft.com/office/word/2006/wordml" xmlns:wp14="http://schemas.microsoft.com/office/word/2010/wordprocessingDrawing" xmlns:wp="http://schemas.openxmlformats.org/drawingml/2006/wordprocessingDrawing" xmlns:wpc="http://schemas.microsoft.com/office/word/2010/wordprocessingCanvas" xmlns:wpg="http://schemas.microsoft.com/office/word/2010/wordprocessingGroup" xmlns:wpi="http://schemas.microsoft.com/office/word/2010/wordprocessingInk" xmlns:wps="http://schemas.microsoft.com/office/word/2010/wordprocessingShape" mc:Ignorable="w14 wp14">
+  <w:p>
+    <w:pPr>
+      <w:pStyle w:val="Header"/>
+      <w:spacing w:after="40"/>
+      <w:jc w:val="right"/>
+      <w:pBdr>
+        <w:bottom w:val="single" w:sz="4" w:space="2" w:color="808080"/>
+      </w:pBdr>
+    </w:pPr>
+    <w:r/>
+    <w:r>
+      <w:rPr>
+        <w:rFonts w:ascii="Arial" w:hAnsi="Arial"/>
+        <w:b/>
+        <w:color w:val="555555"/>
+        <w:sz w:val="20"/>
+      </w:rPr>
+      <w:t>9. Over the Air Updates</w:t>
+    </w:r>
+  </w:p>
+</w:hdr>
+</file>
+
+<file path=word/header111.xml><?xml version="1.0" encoding="utf-8"?>
+<w:hdr xmlns:m="http://schemas.openxmlformats.org/officeDocument/2006/math" xmlns:mc="http://schemas.openxmlformats.org/markup-compatibility/2006" xmlns:mo="http://schemas.microsoft.com/office/mac/office/2008/main" xmlns:mv="urn:schemas-microsoft-com:mac:vml" xmlns:o="urn:schemas-microsoft-com:office:office" xmlns:r="http://schemas.openxmlformats.org/officeDocument/2006/relationships" xmlns:v="urn:schemas-microsoft-com:vml" xmlns:w10="urn:schemas-microsoft-com:office:word" xmlns:w14="http://schemas.microsoft.com/office/word/2010/wordml" xmlns:w="http://schemas.openxmlformats.org/wordprocessingml/2006/main" xmlns:wne="http://schemas.microsoft.com/office/word/2006/wordml" xmlns:wp14="http://schemas.microsoft.com/office/word/2010/wordprocessingDrawing" xmlns:wp="http://schemas.openxmlformats.org/drawingml/2006/wordprocessingDrawing" xmlns:wpc="http://schemas.microsoft.com/office/word/2010/wordprocessingCanvas" xmlns:wpg="http://schemas.microsoft.com/office/word/2010/wordprocessingGroup" xmlns:wpi="http://schemas.microsoft.com/office/word/2010/wordprocessingInk" xmlns:wps="http://schemas.microsoft.com/office/word/2010/wordprocessingShape" mc:Ignorable="w14 wp14">
+  <w:p>
+    <w:pPr>
+      <w:pStyle w:val="Header"/>
+      <w:spacing w:after="40"/>
+      <w:jc w:val="right"/>
+      <w:pBdr>
+        <w:bottom w:val="single" w:sz="4" w:space="2" w:color="808080"/>
+      </w:pBdr>
+    </w:pPr>
+    <w:r/>
+    <w:r>
+      <w:rPr>
+        <w:rFonts w:ascii="Arial" w:hAnsi="Arial"/>
+        <w:b/>
+        <w:color w:val="555555"/>
+        <w:sz w:val="20"/>
+      </w:rPr>
+      <w:t>10. Specifications</w:t>
+    </w:r>
+  </w:p>
+</w:hdr>
+</file>
+
+<file path=word/header112.xml><?xml version="1.0" encoding="utf-8"?>
+<w:hdr xmlns:m="http://schemas.openxmlformats.org/officeDocument/2006/math" xmlns:mc="http://schemas.openxmlformats.org/markup-compatibility/2006" xmlns:mo="http://schemas.microsoft.com/office/mac/office/2008/main" xmlns:mv="urn:schemas-microsoft-com:mac:vml" xmlns:o="urn:schemas-microsoft-com:office:office" xmlns:r="http://schemas.openxmlformats.org/officeDocument/2006/relationships" xmlns:v="urn:schemas-microsoft-com:vml" xmlns:w10="urn:schemas-microsoft-com:office:word" xmlns:w14="http://schemas.microsoft.com/office/word/2010/wordml" xmlns:w="http://schemas.openxmlformats.org/wordprocessingml/2006/main" xmlns:wne="http://schemas.microsoft.com/office/word/2006/wordml" xmlns:wp14="http://schemas.microsoft.com/office/word/2010/wordprocessingDrawing" xmlns:wp="http://schemas.openxmlformats.org/drawingml/2006/wordprocessingDrawing" xmlns:wpc="http://schemas.microsoft.com/office/word/2010/wordprocessingCanvas" xmlns:wpg="http://schemas.microsoft.com/office/word/2010/wordprocessingGroup" xmlns:wpi="http://schemas.microsoft.com/office/word/2010/wordprocessingInk" xmlns:wps="http://schemas.microsoft.com/office/word/2010/wordprocessingShape" mc:Ignorable="w14 wp14">
+  <w:p>
+    <w:pPr>
+      <w:pStyle w:val="Header"/>
+      <w:spacing w:after="40"/>
+      <w:jc w:val="right"/>
+      <w:pBdr>
+        <w:bottom w:val="single" w:sz="4" w:space="2" w:color="808080"/>
+      </w:pBdr>
+    </w:pPr>
+    <w:r/>
+    <w:r>
+      <w:rPr>
+        <w:rFonts w:ascii="Arial" w:hAnsi="Arial"/>
+        <w:b/>
+        <w:color w:val="555555"/>
+        <w:sz w:val="20"/>
+      </w:rPr>
+      <w:t>11. Troubleshooting</w:t>
+    </w:r>
+  </w:p>
+</w:hdr>
+</file>
+
+<file path=word/header113.xml><?xml version="1.0" encoding="utf-8"?>
+<w:hdr xmlns:m="http://schemas.openxmlformats.org/officeDocument/2006/math" xmlns:mc="http://schemas.openxmlformats.org/markup-compatibility/2006" xmlns:mo="http://schemas.microsoft.com/office/mac/office/2008/main" xmlns:mv="urn:schemas-microsoft-com:mac:vml" xmlns:o="urn:schemas-microsoft-com:office:office" xmlns:r="http://schemas.openxmlformats.org/officeDocument/2006/relationships" xmlns:v="urn:schemas-microsoft-com:vml" xmlns:w10="urn:schemas-microsoft-com:office:word" xmlns:w14="http://schemas.microsoft.com/office/word/2010/wordml" xmlns:w="http://schemas.openxmlformats.org/wordprocessingml/2006/main" xmlns:wne="http://schemas.microsoft.com/office/word/2006/wordml" xmlns:wp14="http://schemas.microsoft.com/office/word/2010/wordprocessingDrawing" xmlns:wp="http://schemas.openxmlformats.org/drawingml/2006/wordprocessingDrawing" xmlns:wpc="http://schemas.microsoft.com/office/word/2010/wordprocessingCanvas" xmlns:wpg="http://schemas.microsoft.com/office/word/2010/wordprocessingGroup" xmlns:wpi="http://schemas.microsoft.com/office/word/2010/wordprocessingInk" xmlns:wps="http://schemas.microsoft.com/office/word/2010/wordprocessingShape" mc:Ignorable="w14 wp14">
+  <w:p>
+    <w:pPr>
+      <w:pStyle w:val="Header"/>
+      <w:spacing w:after="40"/>
+      <w:jc w:val="right"/>
+      <w:pBdr>
+        <w:bottom w:val="single" w:sz="4" w:space="2" w:color="808080"/>
+      </w:pBdr>
+    </w:pPr>
+    <w:r/>
+    <w:r>
+      <w:rPr>
+        <w:rFonts w:ascii="Arial" w:hAnsi="Arial"/>
+        <w:b/>
+        <w:color w:val="555555"/>
+        <w:sz w:val="20"/>
+      </w:rPr>
+      <w:t>Notices</w:t>
     </w:r>
   </w:p>
 </w:hdr>
@@ -12220,15 +13241,6 @@
       </w:pBdr>
     </w:pPr>
     <w:r/>
-    <w:r>
-      <w:rPr>
-        <w:rFonts w:ascii="Arial" w:hAnsi="Arial"/>
-        <w:b/>
-        <w:color w:val="555555"/>
-        <w:sz w:val="20"/>
-      </w:rPr>
-      <w:t>Notices</w:t>
-    </w:r>
   </w:p>
 </w:hdr>
 </file>

</xml_diff>